<commit_message>
Front matter materials for piece 1 done
</commit_message>
<xml_diff>
--- a/Front Matter/Template/2_Front-Matter_Template-v4.docx
+++ b/Front Matter/Template/2_Front-Matter_Template-v4.docx
@@ -168,7 +168,27 @@
           <w:szCs w:val="56"/>
           <w:lang w:eastAsia="zh-TW"/>
         </w:rPr>
-        <w:t>For Zhudi, Pipa and Chinese Orchestra</w:t>
+        <w:t xml:space="preserve">For </w:t>
+      </w:r>
+      <w:proofErr w:type="spellStart"/>
+      <w:r>
+        <w:rPr>
+          <w:rFonts w:ascii="Noto Serif" w:eastAsia="Noto Serif SC" w:hAnsi="Noto Serif" w:cs="Noto Serif"/>
+          <w:sz w:val="32"/>
+          <w:szCs w:val="56"/>
+          <w:lang w:eastAsia="zh-TW"/>
+        </w:rPr>
+        <w:t>Zhudi</w:t>
+      </w:r>
+      <w:proofErr w:type="spellEnd"/>
+      <w:r>
+        <w:rPr>
+          <w:rFonts w:ascii="Noto Serif" w:eastAsia="Noto Serif SC" w:hAnsi="Noto Serif" w:cs="Noto Serif"/>
+          <w:sz w:val="32"/>
+          <w:szCs w:val="56"/>
+          <w:lang w:eastAsia="zh-TW"/>
+        </w:rPr>
+        <w:t>, Pipa and Chinese Orchestra</w:t>
       </w:r>
     </w:p>
     <w:p>
@@ -844,7 +864,27 @@
           <w:szCs w:val="56"/>
           <w:lang w:eastAsia="zh-TW"/>
         </w:rPr>
-        <w:t>For Zhudi, Pipa and Chinese Orchestra</w:t>
+        <w:t xml:space="preserve">For </w:t>
+      </w:r>
+      <w:proofErr w:type="spellStart"/>
+      <w:r>
+        <w:rPr>
+          <w:rFonts w:ascii="Noto Serif" w:eastAsia="Noto Serif SC" w:hAnsi="Noto Serif" w:cs="Noto Serif"/>
+          <w:sz w:val="32"/>
+          <w:szCs w:val="56"/>
+          <w:lang w:eastAsia="zh-TW"/>
+        </w:rPr>
+        <w:t>Zhudi</w:t>
+      </w:r>
+      <w:proofErr w:type="spellEnd"/>
+      <w:r>
+        <w:rPr>
+          <w:rFonts w:ascii="Noto Serif" w:eastAsia="Noto Serif SC" w:hAnsi="Noto Serif" w:cs="Noto Serif"/>
+          <w:sz w:val="32"/>
+          <w:szCs w:val="56"/>
+          <w:lang w:eastAsia="zh-TW"/>
+        </w:rPr>
+        <w:t>, Pipa and Chinese Orchestra</w:t>
       </w:r>
     </w:p>
     <w:p>
@@ -1379,6 +1419,7 @@
           <w:color w:val="000000" w:themeColor="text1"/>
           <w:sz w:val="20"/>
           <w:szCs w:val="24"/>
+          <w:lang w:eastAsia="zh-TW"/>
         </w:rPr>
         <w:t>Singapore 068810</w:t>
       </w:r>
@@ -1471,7 +1512,7 @@
     <w:p>
       <w:pPr>
         <w:rPr>
-          <w:rFonts w:ascii="Noto Serif" w:eastAsia="Noto Serif SC" w:hAnsi="Noto Serif" w:hint="eastAsia"/>
+          <w:rFonts w:ascii="Noto Serif" w:eastAsia="Noto Serif SC" w:hAnsi="Noto Serif"/>
           <w:sz w:val="24"/>
           <w:szCs w:val="24"/>
           <w:lang w:eastAsia="zh-TW"/>
@@ -1681,12 +1722,30 @@
     <w:p>
       <w:pPr>
         <w:rPr>
+          <w:rFonts w:ascii="Noto Serif" w:eastAsia="Noto Serif SC" w:hAnsi="Noto Serif"/>
+          <w:sz w:val="24"/>
+          <w:szCs w:val="24"/>
+          <w:lang w:eastAsia="zh-TW"/>
+        </w:rPr>
+      </w:pPr>
+      <w:r>
+        <w:rPr>
           <w:rFonts w:ascii="Noto Serif" w:eastAsia="Noto Serif SC" w:hAnsi="Noto Serif" w:hint="eastAsia"/>
           <w:sz w:val="24"/>
           <w:szCs w:val="24"/>
           <w:lang w:eastAsia="zh-TW"/>
         </w:rPr>
-      </w:pPr>
+        <w:t>他的作品曾於美國、歐洲及亞洲演出。曾獲得的作曲獎項包括</w:t>
+      </w:r>
+      <w:r>
+        <w:rPr>
+          <w:rFonts w:ascii="Noto Serif" w:eastAsia="Noto Serif SC" w:hAnsi="Noto Serif"/>
+          <w:sz w:val="24"/>
+          <w:szCs w:val="24"/>
+          <w:lang w:eastAsia="zh-TW"/>
+        </w:rPr>
+        <w:t xml:space="preserve">Salvatore Martirano </w:t>
+      </w:r>
       <w:r>
         <w:rPr>
           <w:rFonts w:ascii="Noto Serif" w:eastAsia="Noto Serif SC" w:hAnsi="Noto Serif" w:hint="eastAsia"/>
@@ -1694,16 +1753,16 @@
           <w:szCs w:val="24"/>
           <w:lang w:eastAsia="zh-TW"/>
         </w:rPr>
-        <w:t>他的作品曾於美國、歐洲及亞洲演出。曾獲得的作曲獎項包括</w:t>
-      </w:r>
-      <w:r>
-        <w:rPr>
-          <w:rFonts w:ascii="Noto Serif" w:eastAsia="Noto Serif SC" w:hAnsi="Noto Serif"/>
-          <w:sz w:val="24"/>
-          <w:szCs w:val="24"/>
-          <w:lang w:eastAsia="zh-TW"/>
-        </w:rPr>
-        <w:t xml:space="preserve">Salvatore Martirano </w:t>
+        <w:t>紀念國際作曲獎，新加坡中國樂隊國際作曲獎，</w:t>
+      </w:r>
+      <w:r>
+        <w:rPr>
+          <w:rFonts w:ascii="Noto Serif" w:eastAsia="Noto Serif SC" w:hAnsi="Noto Serif"/>
+          <w:sz w:val="24"/>
+          <w:szCs w:val="24"/>
+          <w:lang w:eastAsia="zh-TW"/>
+        </w:rPr>
+        <w:t xml:space="preserve">2011 </w:t>
       </w:r>
       <w:r>
         <w:rPr>
@@ -1712,16 +1771,16 @@
           <w:szCs w:val="24"/>
           <w:lang w:eastAsia="zh-TW"/>
         </w:rPr>
-        <w:t>紀念國際作曲獎，新加坡中國樂隊國際作曲獎，</w:t>
-      </w:r>
-      <w:r>
-        <w:rPr>
-          <w:rFonts w:ascii="Noto Serif" w:eastAsia="Noto Serif SC" w:hAnsi="Noto Serif"/>
-          <w:sz w:val="24"/>
-          <w:szCs w:val="24"/>
-          <w:lang w:eastAsia="zh-TW"/>
-        </w:rPr>
-        <w:t xml:space="preserve">2011 </w:t>
+        <w:t>臺灣音樂中心</w:t>
+      </w:r>
+      <w:r>
+        <w:rPr>
+          <w:rFonts w:ascii="Noto Serif" w:eastAsia="Noto Serif SC" w:hAnsi="Noto Serif"/>
+          <w:sz w:val="24"/>
+          <w:szCs w:val="24"/>
+          <w:lang w:eastAsia="zh-TW"/>
+        </w:rPr>
+        <w:t>TMC</w:t>
       </w:r>
       <w:r>
         <w:rPr>
@@ -1730,16 +1789,16 @@
           <w:szCs w:val="24"/>
           <w:lang w:eastAsia="zh-TW"/>
         </w:rPr>
-        <w:t>臺灣音樂中心</w:t>
-      </w:r>
-      <w:r>
-        <w:rPr>
-          <w:rFonts w:ascii="Noto Serif" w:eastAsia="Noto Serif SC" w:hAnsi="Noto Serif"/>
-          <w:sz w:val="24"/>
-          <w:szCs w:val="24"/>
-          <w:lang w:eastAsia="zh-TW"/>
-        </w:rPr>
-        <w:t>TMC</w:t>
+        <w:t>國際作曲大賽，</w:t>
+      </w:r>
+      <w:r>
+        <w:rPr>
+          <w:rFonts w:ascii="Noto Serif" w:eastAsia="Noto Serif SC" w:hAnsi="Noto Serif"/>
+          <w:sz w:val="24"/>
+          <w:szCs w:val="24"/>
+          <w:lang w:eastAsia="zh-TW"/>
+        </w:rPr>
+        <w:t>Isang Yun</w:t>
       </w:r>
       <w:r>
         <w:rPr>
@@ -1748,16 +1807,16 @@
           <w:szCs w:val="24"/>
           <w:lang w:eastAsia="zh-TW"/>
         </w:rPr>
-        <w:t>國際作曲大賽，</w:t>
-      </w:r>
-      <w:r>
-        <w:rPr>
-          <w:rFonts w:ascii="Noto Serif" w:eastAsia="Noto Serif SC" w:hAnsi="Noto Serif"/>
-          <w:sz w:val="24"/>
-          <w:szCs w:val="24"/>
-          <w:lang w:eastAsia="zh-TW"/>
-        </w:rPr>
-        <w:t>Isang Yun</w:t>
+        <w:t>國際作曲比賽入選獎，海法國際作曲獎、德布西三重奏音樂基金作曲比賽獎、莫利那尼四重奏的第三屆國際作曲比賽、聖保羅室樂團比賽、及</w:t>
+      </w:r>
+      <w:r>
+        <w:rPr>
+          <w:rFonts w:ascii="Noto Serif" w:eastAsia="Noto Serif SC" w:hAnsi="Noto Serif"/>
+          <w:sz w:val="24"/>
+          <w:szCs w:val="24"/>
+          <w:lang w:eastAsia="zh-TW"/>
+        </w:rPr>
+        <w:t>ALEA I</w:t>
       </w:r>
       <w:r>
         <w:rPr>
@@ -1766,16 +1825,16 @@
           <w:szCs w:val="24"/>
           <w:lang w:eastAsia="zh-TW"/>
         </w:rPr>
-        <w:t>國際作曲比賽入選獎，海法國際作曲獎、德布西三重奏音樂基金作曲比賽獎、莫利那尼四重奏的第三屆國際作曲比賽、聖保羅室樂團比賽、及</w:t>
-      </w:r>
-      <w:r>
-        <w:rPr>
-          <w:rFonts w:ascii="Noto Serif" w:eastAsia="Noto Serif SC" w:hAnsi="Noto Serif"/>
-          <w:sz w:val="24"/>
-          <w:szCs w:val="24"/>
-          <w:lang w:eastAsia="zh-TW"/>
-        </w:rPr>
-        <w:t>ALEA I</w:t>
+        <w:t>作曲比賽等。他的作品經</w:t>
+      </w:r>
+      <w:r>
+        <w:rPr>
+          <w:rFonts w:ascii="Noto Serif" w:eastAsia="Noto Serif SC" w:hAnsi="Noto Serif"/>
+          <w:sz w:val="24"/>
+          <w:szCs w:val="24"/>
+          <w:lang w:eastAsia="zh-TW"/>
+        </w:rPr>
+        <w:t>ERM-Media</w:t>
       </w:r>
       <w:r>
         <w:rPr>
@@ -1784,16 +1843,16 @@
           <w:szCs w:val="24"/>
           <w:lang w:eastAsia="zh-TW"/>
         </w:rPr>
-        <w:t>作曲比賽等。他的作品經</w:t>
-      </w:r>
-      <w:r>
-        <w:rPr>
-          <w:rFonts w:ascii="Noto Serif" w:eastAsia="Noto Serif SC" w:hAnsi="Noto Serif"/>
-          <w:sz w:val="24"/>
-          <w:szCs w:val="24"/>
-          <w:lang w:eastAsia="zh-TW"/>
-        </w:rPr>
-        <w:t>ERM-Media</w:t>
+        <w:t>、</w:t>
+      </w:r>
+      <w:r>
+        <w:rPr>
+          <w:rFonts w:ascii="Noto Serif" w:eastAsia="Noto Serif SC" w:hAnsi="Noto Serif"/>
+          <w:sz w:val="24"/>
+          <w:szCs w:val="24"/>
+          <w:lang w:eastAsia="zh-TW"/>
+        </w:rPr>
+        <w:t>PARMA</w:t>
       </w:r>
       <w:r>
         <w:rPr>
@@ -1811,7 +1870,7 @@
           <w:szCs w:val="24"/>
           <w:lang w:eastAsia="zh-TW"/>
         </w:rPr>
-        <w:t>PARMA</w:t>
+        <w:t>North South recording</w:t>
       </w:r>
       <w:r>
         <w:rPr>
@@ -1822,24 +1881,7 @@
         </w:rPr>
         <w:t>、</w:t>
       </w:r>
-      <w:r>
-        <w:rPr>
-          <w:rFonts w:ascii="Noto Serif" w:eastAsia="Noto Serif SC" w:hAnsi="Noto Serif"/>
-          <w:sz w:val="24"/>
-          <w:szCs w:val="24"/>
-          <w:lang w:eastAsia="zh-TW"/>
-        </w:rPr>
-        <w:t>North South recording</w:t>
-      </w:r>
-      <w:r>
-        <w:rPr>
-          <w:rFonts w:ascii="Noto Serif" w:eastAsia="Noto Serif SC" w:hAnsi="Noto Serif" w:hint="eastAsia"/>
-          <w:sz w:val="24"/>
-          <w:szCs w:val="24"/>
-          <w:lang w:eastAsia="zh-TW"/>
-        </w:rPr>
-        <w:t>、</w:t>
-      </w:r>
+      <w:proofErr w:type="spellStart"/>
       <w:r>
         <w:rPr>
           <w:rFonts w:ascii="Noto Serif" w:eastAsia="Noto Serif SC" w:hAnsi="Noto Serif"/>
@@ -1849,6 +1891,7 @@
         </w:rPr>
         <w:t>ATMAClassical</w:t>
       </w:r>
+      <w:proofErr w:type="spellEnd"/>
       <w:r>
         <w:rPr>
           <w:rFonts w:ascii="Noto Serif" w:eastAsia="Noto Serif SC" w:hAnsi="Noto Serif" w:hint="eastAsia"/>
@@ -2102,19 +2145,19 @@
           <w:iCs/>
           <w:lang w:eastAsia="zh-TW"/>
         </w:rPr>
-        <w:t>"Stephen Yip has an extraordinary way of creating a post-Darmstadtian modernism that incorporates his Chinese roots with a subtlety that gives us a vivid experience of the inner colors of an advanced spatial sense. It leaves us with a feeling of focused tranquility. He is a genuine voice in new music today." —Gapplegate Classical-Modern Music Review</w:t>
-      </w:r>
-    </w:p>
-    <w:p>
-      <w:pPr>
-        <w:spacing w:after="160" w:line="278" w:lineRule="auto"/>
+        <w:t>"Stephen Yip has an extraordinary way of creating a post-</w:t>
+      </w:r>
+      <w:proofErr w:type="spellStart"/>
+      <w:r>
         <w:rPr>
           <w:rFonts w:ascii="Noto Serif" w:eastAsia="Noto Serif SC" w:hAnsi="Noto Serif"/>
           <w:i/>
           <w:iCs/>
           <w:lang w:eastAsia="zh-TW"/>
         </w:rPr>
-      </w:pPr>
+        <w:t>Darmstadtian</w:t>
+      </w:r>
+      <w:proofErr w:type="spellEnd"/>
       <w:r>
         <w:rPr>
           <w:rFonts w:ascii="Noto Serif" w:eastAsia="Noto Serif SC" w:hAnsi="Noto Serif"/>
@@ -2122,8 +2165,9 @@
           <w:iCs/>
           <w:lang w:eastAsia="zh-TW"/>
         </w:rPr>
-        <w:t>“</w:t>
-      </w:r>
+        <w:t xml:space="preserve"> modernism that incorporates his Chinese roots with a subtlety that gives us a vivid experience of the inner </w:t>
+      </w:r>
+      <w:proofErr w:type="spellStart"/>
       <w:r>
         <w:rPr>
           <w:rFonts w:ascii="Noto Serif" w:eastAsia="Noto Serif SC" w:hAnsi="Noto Serif"/>
@@ -2131,8 +2175,9 @@
           <w:iCs/>
           <w:lang w:eastAsia="zh-TW"/>
         </w:rPr>
-        <w:t>….</w:t>
-      </w:r>
+        <w:t>colors</w:t>
+      </w:r>
+      <w:proofErr w:type="spellEnd"/>
       <w:r>
         <w:rPr>
           <w:rFonts w:ascii="Noto Serif" w:eastAsia="Noto Serif SC" w:hAnsi="Noto Serif"/>
@@ -2140,8 +2185,9 @@
           <w:iCs/>
           <w:lang w:eastAsia="zh-TW"/>
         </w:rPr>
-        <w:t xml:space="preserve"> </w:t>
-      </w:r>
+        <w:t xml:space="preserve"> of an advanced spatial sense. It leaves us with a feeling of focused </w:t>
+      </w:r>
+      <w:proofErr w:type="spellStart"/>
       <w:r>
         <w:rPr>
           <w:rFonts w:ascii="Noto Serif" w:eastAsia="Noto Serif SC" w:hAnsi="Noto Serif"/>
@@ -2149,8 +2195,9 @@
           <w:iCs/>
           <w:lang w:eastAsia="zh-TW"/>
         </w:rPr>
-        <w:t>abound in colourful texture that take their cue from traditional Asian music….</w:t>
-      </w:r>
+        <w:t>tranquility</w:t>
+      </w:r>
+      <w:proofErr w:type="spellEnd"/>
       <w:r>
         <w:rPr>
           <w:rFonts w:ascii="Noto Serif" w:eastAsia="Noto Serif SC" w:hAnsi="Noto Serif"/>
@@ -2158,8 +2205,9 @@
           <w:iCs/>
           <w:lang w:eastAsia="zh-TW"/>
         </w:rPr>
-        <w:t xml:space="preserve"> </w:t>
-      </w:r>
+        <w:t>. He is a genuine voice in new music today." —</w:t>
+      </w:r>
+      <w:proofErr w:type="spellStart"/>
       <w:r>
         <w:rPr>
           <w:rFonts w:ascii="Noto Serif" w:eastAsia="Noto Serif SC" w:hAnsi="Noto Serif"/>
@@ -2167,8 +2215,9 @@
           <w:iCs/>
           <w:lang w:eastAsia="zh-TW"/>
         </w:rPr>
-        <w:t>and….</w:t>
-      </w:r>
+        <w:t>Gapplegate</w:t>
+      </w:r>
+      <w:proofErr w:type="spellEnd"/>
       <w:r>
         <w:rPr>
           <w:rFonts w:ascii="Noto Serif" w:eastAsia="Noto Serif SC" w:hAnsi="Noto Serif"/>
@@ -2176,28 +2225,28 @@
           <w:iCs/>
           <w:lang w:eastAsia="zh-TW"/>
         </w:rPr>
-        <w:t xml:space="preserve"> </w:t>
-      </w:r>
-      <w:r>
+        <w:t xml:space="preserve"> Classical-Modern Music Review</w:t>
+      </w:r>
+    </w:p>
+    <w:p>
+      <w:pPr>
+        <w:spacing w:after="160" w:line="278" w:lineRule="auto"/>
         <w:rPr>
           <w:rFonts w:ascii="Noto Serif" w:eastAsia="Noto Serif SC" w:hAnsi="Noto Serif"/>
           <w:i/>
           <w:iCs/>
           <w:lang w:eastAsia="zh-TW"/>
         </w:rPr>
-        <w:t>Yip’s splendid ear and sophisticated technique stand him in good stead….”</w:t>
-      </w:r>
-    </w:p>
-    <w:p>
-      <w:pPr>
-        <w:spacing w:after="160" w:line="278" w:lineRule="auto"/>
+      </w:pPr>
+      <w:r>
         <w:rPr>
           <w:rFonts w:ascii="Noto Serif" w:eastAsia="Noto Serif SC" w:hAnsi="Noto Serif"/>
           <w:i/>
           <w:iCs/>
           <w:lang w:eastAsia="zh-TW"/>
         </w:rPr>
-      </w:pPr>
+        <w:t>“</w:t>
+      </w:r>
       <w:r>
         <w:rPr>
           <w:rFonts w:ascii="Noto Serif" w:eastAsia="Noto Serif SC" w:hAnsi="Noto Serif"/>
@@ -2205,6 +2254,80 @@
           <w:iCs/>
           <w:lang w:eastAsia="zh-TW"/>
         </w:rPr>
+        <w:t>….</w:t>
+      </w:r>
+      <w:r>
+        <w:rPr>
+          <w:rFonts w:ascii="Noto Serif" w:eastAsia="Noto Serif SC" w:hAnsi="Noto Serif"/>
+          <w:i/>
+          <w:iCs/>
+          <w:lang w:eastAsia="zh-TW"/>
+        </w:rPr>
+        <w:t xml:space="preserve"> </w:t>
+      </w:r>
+      <w:r>
+        <w:rPr>
+          <w:rFonts w:ascii="Noto Serif" w:eastAsia="Noto Serif SC" w:hAnsi="Noto Serif"/>
+          <w:i/>
+          <w:iCs/>
+          <w:lang w:eastAsia="zh-TW"/>
+        </w:rPr>
+        <w:t>abound in colourful texture that take their cue from traditional Asian music….</w:t>
+      </w:r>
+      <w:r>
+        <w:rPr>
+          <w:rFonts w:ascii="Noto Serif" w:eastAsia="Noto Serif SC" w:hAnsi="Noto Serif"/>
+          <w:i/>
+          <w:iCs/>
+          <w:lang w:eastAsia="zh-TW"/>
+        </w:rPr>
+        <w:t xml:space="preserve"> </w:t>
+      </w:r>
+      <w:r>
+        <w:rPr>
+          <w:rFonts w:ascii="Noto Serif" w:eastAsia="Noto Serif SC" w:hAnsi="Noto Serif"/>
+          <w:i/>
+          <w:iCs/>
+          <w:lang w:eastAsia="zh-TW"/>
+        </w:rPr>
+        <w:t>and….</w:t>
+      </w:r>
+      <w:r>
+        <w:rPr>
+          <w:rFonts w:ascii="Noto Serif" w:eastAsia="Noto Serif SC" w:hAnsi="Noto Serif"/>
+          <w:i/>
+          <w:iCs/>
+          <w:lang w:eastAsia="zh-TW"/>
+        </w:rPr>
+        <w:t xml:space="preserve"> </w:t>
+      </w:r>
+      <w:r>
+        <w:rPr>
+          <w:rFonts w:ascii="Noto Serif" w:eastAsia="Noto Serif SC" w:hAnsi="Noto Serif"/>
+          <w:i/>
+          <w:iCs/>
+          <w:lang w:eastAsia="zh-TW"/>
+        </w:rPr>
+        <w:t>Yip’s splendid ear and sophisticated technique stand him in good stead….”</w:t>
+      </w:r>
+    </w:p>
+    <w:p>
+      <w:pPr>
+        <w:spacing w:after="160" w:line="278" w:lineRule="auto"/>
+        <w:rPr>
+          <w:rFonts w:ascii="Noto Serif" w:eastAsia="Noto Serif SC" w:hAnsi="Noto Serif"/>
+          <w:i/>
+          <w:iCs/>
+          <w:lang w:eastAsia="zh-TW"/>
+        </w:rPr>
+      </w:pPr>
+      <w:r>
+        <w:rPr>
+          <w:rFonts w:ascii="Noto Serif" w:eastAsia="Noto Serif SC" w:hAnsi="Noto Serif"/>
+          <w:i/>
+          <w:iCs/>
+          <w:lang w:eastAsia="zh-TW"/>
+        </w:rPr>
         <w:t>—Gramophone Review</w:t>
       </w:r>
     </w:p>
@@ -2237,7 +2360,23 @@
           <w:rFonts w:ascii="Noto Serif" w:eastAsia="Noto Serif SC" w:hAnsi="Noto Serif"/>
           <w:lang w:eastAsia="zh-TW"/>
         </w:rPr>
-        <w:t>Born in Hong Kong and now living in U.S.A. He received his Doctor of Musical Arts (D.M.A.) at Rice University and Bachelor of Fine Arts (B.F.A.) at the Hong Kong Academy for Performing Arts. He has attended major music festivals including: Wellesley Composers Conference, Aspen Music Festival, International Summer Course for New Music Darmstadt, Asian Composers’ League, ISCM World Music Days, Chinese Composers’ Festival, Music X, June in Buffalo, IMPULS Ensemble Akademie, California E.A.R. Unit Composer Seminar, the 13th International Summer Program, Czech Republic, International Composers’ Workshop, Luxembourg, the International Summer Course for New Music, Darmstadt, Germany, Wellesley Composers’ Conference. Residencies include: the Atlantic Center for the Arts, Florida, Kimmel Harding Nelson Center for the Arts, Nebraska, Virginia Center for the Creative Arts, Yaddo Colony, NY and the MacDowell Colony, NH.</w:t>
+        <w:t xml:space="preserve">Born in Hong Kong and now living in U.S.A. He received his Doctor of Musical Arts (D.M.A.) at Rice University and Bachelor of Fine Arts (B.F.A.) at the Hong Kong Academy for Performing Arts. He has attended major music festivals including: Wellesley Composers Conference, Aspen Music Festival, International Summer Course for New Music Darmstadt, Asian Composers’ League, ISCM World Music Days, Chinese Composers’ Festival, Music X, June in Buffalo, IMPULS Ensemble Akademie, California E.A.R. Unit Composer Seminar, the 13th International Summer Program, Czech Republic, International Composers’ Workshop, Luxembourg, the International Summer Course for New Music, Darmstadt, Germany, Wellesley Composers’ Conference. Residencies include: the Atlantic Center for the Arts, Florida, Kimmel Harding Nelson Center for the Arts, Nebraska, Virginia Center for the Creative Arts, </w:t>
+      </w:r>
+      <w:proofErr w:type="spellStart"/>
+      <w:r>
+        <w:rPr>
+          <w:rFonts w:ascii="Noto Serif" w:eastAsia="Noto Serif SC" w:hAnsi="Noto Serif"/>
+          <w:lang w:eastAsia="zh-TW"/>
+        </w:rPr>
+        <w:t>Yaddo</w:t>
+      </w:r>
+      <w:proofErr w:type="spellEnd"/>
+      <w:r>
+        <w:rPr>
+          <w:rFonts w:ascii="Noto Serif" w:eastAsia="Noto Serif SC" w:hAnsi="Noto Serif"/>
+          <w:lang w:eastAsia="zh-TW"/>
+        </w:rPr>
+        <w:t xml:space="preserve"> Colony, NY and the MacDowell Colony, NH.</w:t>
       </w:r>
     </w:p>
     <w:p>
@@ -2253,7 +2392,23 @@
           <w:rFonts w:ascii="Noto Serif" w:eastAsia="Noto Serif SC" w:hAnsi="Noto Serif"/>
           <w:lang w:eastAsia="zh-TW"/>
         </w:rPr>
-        <w:t>Yip’s works have been performed in the United States, Canada, Costa Rica, Israel, Austria, Croatia, Czech Republic, Luxembourg, Germany, Italy, Korea, Japan, Indonesia, Hong Kong, Taiwan, Singapore, and Philippines. He has received several composition prizes, included “Earplay”, “Salvatore Martirano Memorial Composition Award”, “Taiwan Music Center International Composition Prize”, “Robert Avalon International Prize”, “Singapore International Composition Competition for Chinese Orchestra”, “Haifa International Composition Prize”, First International EPICMUSIC Composition Prize, Italy, International Biennial composition competition, the Debussy Trio Music Foundation, Molinari Quartet’s Third International Composition Competition, the St. Paul Chamber Orchestra Emerging, the ALEA III composition Competition, the fourth NACUSA Texas Composition Competition, the International Music Prize for Excellence in Composition 2010, by the National Academy of Music, Thessaloniki, Greece, and the 2010 Alvarez Chamber Orchestra Freestyle Composition Competition, London, England .</w:t>
+        <w:t>Yip’s works have been performed in the United States, Canada, Costa Rica, Israel, Austria, Croatia, Czech Republic, Luxembourg, Germany, Italy, Korea, Japan, Indonesia, Hong Kong, Taiwan, Singapore, and Philippines. He has received several composition prizes, included “</w:t>
+      </w:r>
+      <w:proofErr w:type="spellStart"/>
+      <w:r>
+        <w:rPr>
+          <w:rFonts w:ascii="Noto Serif" w:eastAsia="Noto Serif SC" w:hAnsi="Noto Serif"/>
+          <w:lang w:eastAsia="zh-TW"/>
+        </w:rPr>
+        <w:t>Earplay</w:t>
+      </w:r>
+      <w:proofErr w:type="spellEnd"/>
+      <w:r>
+        <w:rPr>
+          <w:rFonts w:ascii="Noto Serif" w:eastAsia="Noto Serif SC" w:hAnsi="Noto Serif"/>
+          <w:lang w:eastAsia="zh-TW"/>
+        </w:rPr>
+        <w:t>”, “Salvatore Martirano Memorial Composition Award”, “Taiwan Music Center International Composition Prize”, “Robert Avalon International Prize”, “Singapore International Composition Competition for Chinese Orchestra”, “Haifa International Composition Prize”, First International EPICMUSIC Composition Prize, Italy, International Biennial composition competition, the Debussy Trio Music Foundation, Molinari Quartet’s Third International Composition Competition, the St. Paul Chamber Orchestra Emerging, the ALEA III composition Competition, the fourth NACUSA Texas Composition Competition, the International Music Prize for Excellence in Composition 2010, by the National Academy of Music, Thessaloniki, Greece, and the 2010 Alvarez Chamber Orchestra Freestyle Composition Competition, London, England .</w:t>
       </w:r>
     </w:p>
     <w:p>
@@ -2269,15 +2424,56 @@
           <w:rFonts w:ascii="Noto Serif" w:eastAsia="Noto Serif SC" w:hAnsi="Noto Serif"/>
           <w:lang w:eastAsia="zh-TW"/>
         </w:rPr>
-        <w:t xml:space="preserve">His works have been performed by major ensembles and players such as Alarm Will Sound, Earplay New Music, Mivos String Quartet, New York New Music Ensemble, Great Noise Ensemble, North South Consonance, Brno Philharmonic Orchestra, </w:t>
-      </w:r>
+        <w:t xml:space="preserve">His works have been performed by major ensembles and players such as Alarm Will Sound, </w:t>
+      </w:r>
+      <w:proofErr w:type="spellStart"/>
+      <w:r>
+        <w:rPr>
+          <w:rFonts w:ascii="Noto Serif" w:eastAsia="Noto Serif SC" w:hAnsi="Noto Serif"/>
+          <w:lang w:eastAsia="zh-TW"/>
+        </w:rPr>
+        <w:t>Earplay</w:t>
+      </w:r>
+      <w:proofErr w:type="spellEnd"/>
+      <w:r>
+        <w:rPr>
+          <w:rFonts w:ascii="Noto Serif" w:eastAsia="Noto Serif SC" w:hAnsi="Noto Serif"/>
+          <w:lang w:eastAsia="zh-TW"/>
+        </w:rPr>
+        <w:t xml:space="preserve"> New Music, </w:t>
+      </w:r>
+      <w:proofErr w:type="spellStart"/>
+      <w:r>
+        <w:rPr>
+          <w:rFonts w:ascii="Noto Serif" w:eastAsia="Noto Serif SC" w:hAnsi="Noto Serif"/>
+          <w:lang w:eastAsia="zh-TW"/>
+        </w:rPr>
+        <w:t>Mivos</w:t>
+      </w:r>
+      <w:proofErr w:type="spellEnd"/>
+      <w:r>
+        <w:rPr>
+          <w:rFonts w:ascii="Noto Serif" w:eastAsia="Noto Serif SC" w:hAnsi="Noto Serif"/>
+          <w:lang w:eastAsia="zh-TW"/>
+        </w:rPr>
+        <w:t xml:space="preserve"> String Quartet, New York New Music Ensemble, Great Noise Ensemble, North South Consonance, Brno Philharmonic Orchestra, </w:t>
+      </w:r>
+      <w:proofErr w:type="spellStart"/>
       <w:r>
         <w:rPr>
           <w:rFonts w:ascii="Noto Serif" w:eastAsia="Noto Serif SC" w:hAnsi="Noto Serif"/>
           <w:lang w:eastAsia="zh-TW"/>
         </w:rPr>
         <w:lastRenderedPageBreak/>
-        <w:t>inFLUX Duo, Windpipe Chinese Orchestra, Little Giant Chinese Orchestra, Hong Kong Chinese Orchestra, St. Paul Chamber Orchestra, Curious Chamber Players, TIMF Ensemble, Ensemble El Perro Andaluz, Hong Kong Sinfonietta, Singapore Chinese Orchestra, Avanti, Ensemble Kochi, Moscow New Music Ensemble, etc.</w:t>
+        <w:t>inFLUX</w:t>
+      </w:r>
+      <w:proofErr w:type="spellEnd"/>
+      <w:r>
+        <w:rPr>
+          <w:rFonts w:ascii="Noto Serif" w:eastAsia="Noto Serif SC" w:hAnsi="Noto Serif"/>
+          <w:lang w:eastAsia="zh-TW"/>
+        </w:rPr>
+        <w:t xml:space="preserve"> Duo, Windpipe Chinese Orchestra, Little Giant Chinese Orchestra, Hong Kong Chinese Orchestra, St. Paul Chamber Orchestra, Curious Chamber Players, TIMF Ensemble, Ensemble El Perro Andaluz, Hong Kong Sinfonietta, Singapore Chinese Orchestra, Avanti, Ensemble Kochi, Moscow New Music Ensemble, etc.</w:t>
       </w:r>
     </w:p>
     <w:p>
@@ -2399,7 +2595,7 @@
           <w:bottom w:val="single" w:sz="6" w:space="1" w:color="auto"/>
         </w:pBdr>
         <w:rPr>
-          <w:rFonts w:ascii="Noto Serif" w:eastAsia="Noto Serif SC" w:hAnsi="Noto Serif" w:cs="Noto Serif" w:hint="eastAsia"/>
+          <w:rFonts w:ascii="Noto Serif" w:eastAsia="Noto Serif SC" w:hAnsi="Noto Serif" w:cs="Noto Serif"/>
           <w:noProof/>
           <w:sz w:val="24"/>
           <w:szCs w:val="24"/>
@@ -2519,8 +2715,55 @@
           <w:szCs w:val="24"/>
           <w:lang w:eastAsia="zh-TW"/>
         </w:rPr>
-        <w:t xml:space="preserve">Nine </w:t>
-      </w:r>
+        <w:t>Nine Actors</w:t>
+      </w:r>
+      <w:r>
+        <w:rPr>
+          <w:rFonts w:ascii="Noto Serif" w:eastAsia="Noto Serif SC" w:hAnsi="Noto Serif" w:cs="Noto Serif"/>
+          <w:sz w:val="24"/>
+          <w:szCs w:val="24"/>
+          <w:lang w:eastAsia="zh-TW"/>
+        </w:rPr>
+        <w:t xml:space="preserve"> </w:t>
+      </w:r>
+      <w:r>
+        <w:rPr>
+          <w:rFonts w:ascii="Noto Serif" w:eastAsia="Noto Serif SC" w:hAnsi="Noto Serif" w:cs="Noto Serif"/>
+          <w:sz w:val="24"/>
+          <w:szCs w:val="24"/>
+          <w:lang w:eastAsia="zh-TW"/>
+        </w:rPr>
+        <w:t>(</w:t>
+      </w:r>
+      <w:r>
+        <w:rPr>
+          <w:rFonts w:ascii="Noto Serif" w:eastAsia="Noto Serif SC" w:hAnsi="Noto Serif" w:cs="Noto Serif" w:hint="eastAsia"/>
+          <w:noProof/>
+          <w:sz w:val="24"/>
+          <w:szCs w:val="24"/>
+          <w:lang w:eastAsia="zh-TW"/>
+        </w:rPr>
+        <w:t>九角子</w:t>
+      </w:r>
+      <w:r>
+        <w:rPr>
+          <w:rFonts w:ascii="Noto Serif" w:eastAsia="Noto Serif SC" w:hAnsi="Noto Serif" w:cs="Noto Serif"/>
+          <w:sz w:val="24"/>
+          <w:szCs w:val="24"/>
+          <w:lang w:eastAsia="zh-TW"/>
+        </w:rPr>
+        <w:t xml:space="preserve">) </w:t>
+      </w:r>
+      <w:r>
+        <w:rPr>
+          <w:rFonts w:ascii="Noto Serif" w:eastAsia="Noto Serif SC" w:hAnsi="Noto Serif" w:cs="Noto Serif"/>
+          <w:sz w:val="24"/>
+          <w:szCs w:val="24"/>
+          <w:lang w:eastAsia="zh-TW"/>
+        </w:rPr>
+        <w:t xml:space="preserve">is based on a traditional Fujianese local drama called </w:t>
+      </w:r>
+      <w:proofErr w:type="spellStart"/>
       <w:r>
         <w:rPr>
           <w:rFonts w:ascii="Noto Serif" w:eastAsia="Noto Serif SC" w:hAnsi="Noto Serif" w:cs="Noto Serif"/>
@@ -2530,108 +2773,9 @@
           <w:szCs w:val="24"/>
           <w:lang w:eastAsia="zh-TW"/>
         </w:rPr>
-        <w:t>Actors</w:t>
-      </w:r>
-      <w:r>
-        <w:rPr>
-          <w:rFonts w:ascii="Noto Serif" w:eastAsia="Noto Serif SC" w:hAnsi="Noto Serif" w:cs="Noto Serif"/>
-          <w:sz w:val="24"/>
-          <w:szCs w:val="24"/>
-          <w:lang w:eastAsia="zh-TW"/>
-        </w:rPr>
-        <w:t xml:space="preserve"> </w:t>
-      </w:r>
-      <w:r>
-        <w:rPr>
-          <w:rFonts w:ascii="Noto Serif" w:eastAsia="Noto Serif SC" w:hAnsi="Noto Serif" w:cs="Noto Serif"/>
-          <w:sz w:val="24"/>
-          <w:szCs w:val="24"/>
-          <w:lang w:eastAsia="zh-TW"/>
-        </w:rPr>
-        <w:t>(</w:t>
-      </w:r>
-      <w:r>
-        <w:rPr>
-          <w:rFonts w:ascii="Noto Serif" w:eastAsia="Noto Serif SC" w:hAnsi="Noto Serif" w:cs="Noto Serif" w:hint="eastAsia"/>
-          <w:noProof/>
-          <w:sz w:val="24"/>
-          <w:szCs w:val="24"/>
-          <w:lang w:eastAsia="zh-TW"/>
-        </w:rPr>
-        <w:t>九角子</w:t>
-      </w:r>
-      <w:r>
-        <w:rPr>
-          <w:rFonts w:ascii="Noto Serif" w:eastAsia="Noto Serif SC" w:hAnsi="Noto Serif" w:cs="Noto Serif"/>
-          <w:sz w:val="24"/>
-          <w:szCs w:val="24"/>
-          <w:lang w:eastAsia="zh-TW"/>
-        </w:rPr>
-        <w:t xml:space="preserve">) </w:t>
-      </w:r>
-      <w:r>
-        <w:rPr>
-          <w:rFonts w:ascii="Noto Serif" w:eastAsia="Noto Serif SC" w:hAnsi="Noto Serif" w:cs="Noto Serif"/>
-          <w:sz w:val="24"/>
-          <w:szCs w:val="24"/>
-          <w:lang w:eastAsia="zh-TW"/>
-        </w:rPr>
-        <w:t xml:space="preserve">is based on </w:t>
-      </w:r>
-      <w:r>
-        <w:rPr>
-          <w:rFonts w:ascii="Noto Serif" w:eastAsia="Noto Serif SC" w:hAnsi="Noto Serif" w:cs="Noto Serif"/>
-          <w:sz w:val="24"/>
-          <w:szCs w:val="24"/>
-          <w:lang w:eastAsia="zh-TW"/>
-        </w:rPr>
-        <w:t xml:space="preserve">a </w:t>
-      </w:r>
-      <w:r>
-        <w:rPr>
-          <w:rFonts w:ascii="Noto Serif" w:eastAsia="Noto Serif SC" w:hAnsi="Noto Serif" w:cs="Noto Serif"/>
-          <w:sz w:val="24"/>
-          <w:szCs w:val="24"/>
-          <w:lang w:eastAsia="zh-TW"/>
-        </w:rPr>
-        <w:t>traditional Fujian</w:t>
-      </w:r>
-      <w:r>
-        <w:rPr>
-          <w:rFonts w:ascii="Noto Serif" w:eastAsia="Noto Serif SC" w:hAnsi="Noto Serif" w:cs="Noto Serif"/>
-          <w:sz w:val="24"/>
-          <w:szCs w:val="24"/>
-          <w:lang w:eastAsia="zh-TW"/>
-        </w:rPr>
-        <w:t>ese</w:t>
-      </w:r>
-      <w:r>
-        <w:rPr>
-          <w:rFonts w:ascii="Noto Serif" w:eastAsia="Noto Serif SC" w:hAnsi="Noto Serif" w:cs="Noto Serif"/>
-          <w:sz w:val="24"/>
-          <w:szCs w:val="24"/>
-          <w:lang w:eastAsia="zh-TW"/>
-        </w:rPr>
-        <w:t xml:space="preserve"> local drama</w:t>
-      </w:r>
-      <w:r>
-        <w:rPr>
-          <w:rFonts w:ascii="Noto Serif" w:eastAsia="Noto Serif SC" w:hAnsi="Noto Serif" w:cs="Noto Serif"/>
-          <w:sz w:val="24"/>
-          <w:szCs w:val="24"/>
-          <w:lang w:eastAsia="zh-TW"/>
-        </w:rPr>
-        <w:t xml:space="preserve"> called</w:t>
-      </w:r>
-      <w:r>
-        <w:rPr>
-          <w:rFonts w:ascii="Noto Serif" w:eastAsia="Noto Serif SC" w:hAnsi="Noto Serif" w:cs="Noto Serif"/>
-          <w:sz w:val="24"/>
-          <w:szCs w:val="24"/>
-          <w:lang w:eastAsia="zh-TW"/>
-        </w:rPr>
-        <w:t xml:space="preserve"> </w:t>
-      </w:r>
+        <w:t>Gaojia</w:t>
+      </w:r>
+      <w:proofErr w:type="spellEnd"/>
       <w:r>
         <w:rPr>
           <w:rFonts w:ascii="Noto Serif" w:eastAsia="Noto Serif SC" w:hAnsi="Noto Serif" w:cs="Noto Serif"/>
@@ -2641,7 +2785,7 @@
           <w:szCs w:val="24"/>
           <w:lang w:eastAsia="zh-TW"/>
         </w:rPr>
-        <w:t>Gaojia Opera</w:t>
+        <w:t xml:space="preserve"> Opera</w:t>
       </w:r>
       <w:r>
         <w:rPr>
@@ -2686,16 +2830,7 @@
           <w:szCs w:val="24"/>
           <w:lang w:eastAsia="zh-TW"/>
         </w:rPr>
-        <w:t>i</w:t>
-      </w:r>
-      <w:r>
-        <w:rPr>
-          <w:rFonts w:ascii="Noto Serif" w:eastAsia="Noto Serif SC" w:hAnsi="Noto Serif" w:cs="Noto Serif"/>
-          <w:sz w:val="24"/>
-          <w:szCs w:val="24"/>
-          <w:lang w:eastAsia="zh-TW"/>
-        </w:rPr>
-        <w:t>ts original title roughly translat</w:t>
+        <w:t>its original title roughly translat</w:t>
       </w:r>
       <w:r>
         <w:rPr>
@@ -2731,43 +2866,44 @@
           <w:szCs w:val="24"/>
           <w:lang w:eastAsia="zh-TW"/>
         </w:rPr>
-        <w:t>“</w:t>
-      </w:r>
-      <w:r>
-        <w:rPr>
-          <w:rFonts w:ascii="Noto Serif" w:eastAsia="Noto Serif SC" w:hAnsi="Noto Serif" w:cs="Noto Serif"/>
-          <w:sz w:val="24"/>
-          <w:szCs w:val="24"/>
-          <w:lang w:eastAsia="zh-TW"/>
-        </w:rPr>
-        <w:t xml:space="preserve">Nine </w:t>
-      </w:r>
-      <w:r>
-        <w:rPr>
-          <w:rFonts w:ascii="Noto Serif" w:eastAsia="Noto Serif SC" w:hAnsi="Noto Serif" w:cs="Noto Serif"/>
-          <w:sz w:val="24"/>
-          <w:szCs w:val="24"/>
-          <w:lang w:eastAsia="zh-TW"/>
-        </w:rPr>
-        <w:t xml:space="preserve">Actors’ </w:t>
-      </w:r>
-      <w:r>
-        <w:rPr>
-          <w:rFonts w:ascii="Noto Serif" w:eastAsia="Noto Serif SC" w:hAnsi="Noto Serif" w:cs="Noto Serif"/>
-          <w:sz w:val="24"/>
-          <w:szCs w:val="24"/>
-          <w:lang w:eastAsia="zh-TW"/>
-        </w:rPr>
-        <w:t>Opera</w:t>
-      </w:r>
-      <w:r>
-        <w:rPr>
-          <w:rFonts w:ascii="Noto Serif" w:eastAsia="Noto Serif SC" w:hAnsi="Noto Serif" w:cs="Noto Serif"/>
-          <w:sz w:val="24"/>
-          <w:szCs w:val="24"/>
-          <w:lang w:eastAsia="zh-TW"/>
-        </w:rPr>
-        <w:t>”,</w:t>
+        <w:t xml:space="preserve">“Nine Actors’ Opera”, in which </w:t>
+      </w:r>
+      <w:r>
+        <w:rPr>
+          <w:rFonts w:ascii="Noto Serif" w:eastAsia="Noto Serif SC" w:hAnsi="Noto Serif" w:cs="Noto Serif"/>
+          <w:sz w:val="24"/>
+          <w:szCs w:val="24"/>
+          <w:lang w:eastAsia="zh-TW"/>
+        </w:rPr>
+        <w:t>said</w:t>
+      </w:r>
+      <w:r>
+        <w:rPr>
+          <w:rFonts w:ascii="Noto Serif" w:eastAsia="Noto Serif SC" w:hAnsi="Noto Serif" w:cs="Noto Serif"/>
+          <w:sz w:val="24"/>
+          <w:szCs w:val="24"/>
+          <w:lang w:eastAsia="zh-TW"/>
+        </w:rPr>
+        <w:t xml:space="preserve"> opera would feature nine actors (</w:t>
+      </w:r>
+      <w:r>
+        <w:rPr>
+          <w:rFonts w:ascii="Noto Serif" w:eastAsia="Noto Serif SC" w:hAnsi="Noto Serif" w:cs="Noto Serif"/>
+          <w:noProof/>
+          <w:sz w:val="24"/>
+          <w:szCs w:val="24"/>
+          <w:lang w:eastAsia="zh-TW"/>
+        </w:rPr>
+        <w:t>角</w:t>
+      </w:r>
+      <w:r>
+        <w:rPr>
+          <w:rFonts w:ascii="Noto Serif" w:eastAsia="Noto Serif SC" w:hAnsi="Noto Serif" w:cs="Noto Serif"/>
+          <w:sz w:val="24"/>
+          <w:szCs w:val="24"/>
+          <w:lang w:eastAsia="zh-TW"/>
+        </w:rPr>
+        <w:t>).</w:t>
       </w:r>
       <w:r>
         <w:rPr>
@@ -2783,80 +2919,43 @@
           <w:rFonts w:ascii="Noto Serif" w:eastAsia="Noto Serif SC" w:hAnsi="Noto Serif" w:cs="Noto Serif"/>
           <w:sz w:val="24"/>
           <w:szCs w:val="24"/>
-          <w:lang w:eastAsia="zh-TW"/>
-        </w:rPr>
-        <w:t xml:space="preserve">in which </w:t>
-      </w:r>
-      <w:r>
-        <w:rPr>
-          <w:rFonts w:ascii="Noto Serif" w:eastAsia="Noto Serif SC" w:hAnsi="Noto Serif" w:cs="Noto Serif"/>
-          <w:sz w:val="24"/>
-          <w:szCs w:val="24"/>
-          <w:lang w:eastAsia="zh-TW"/>
-        </w:rPr>
-        <w:t>said</w:t>
-      </w:r>
-      <w:r>
-        <w:rPr>
-          <w:rFonts w:ascii="Noto Serif" w:eastAsia="Noto Serif SC" w:hAnsi="Noto Serif" w:cs="Noto Serif"/>
-          <w:sz w:val="24"/>
-          <w:szCs w:val="24"/>
-          <w:lang w:eastAsia="zh-TW"/>
-        </w:rPr>
-        <w:t xml:space="preserve"> opera would feature </w:t>
-      </w:r>
-      <w:r>
-        <w:rPr>
-          <w:rFonts w:ascii="Noto Serif" w:eastAsia="Noto Serif SC" w:hAnsi="Noto Serif" w:cs="Noto Serif"/>
-          <w:sz w:val="24"/>
-          <w:szCs w:val="24"/>
-          <w:lang w:eastAsia="zh-TW"/>
-        </w:rPr>
-        <w:t xml:space="preserve">nine </w:t>
-      </w:r>
-      <w:r>
-        <w:rPr>
-          <w:rFonts w:ascii="Noto Serif" w:eastAsia="Noto Serif SC" w:hAnsi="Noto Serif" w:cs="Noto Serif"/>
-          <w:sz w:val="24"/>
-          <w:szCs w:val="24"/>
-          <w:lang w:eastAsia="zh-TW"/>
-        </w:rPr>
-        <w:t>actors (</w:t>
-      </w:r>
-      <w:r>
-        <w:rPr>
-          <w:rFonts w:ascii="Noto Serif" w:eastAsia="Noto Serif SC" w:hAnsi="Noto Serif" w:cs="Noto Serif"/>
-          <w:noProof/>
-          <w:sz w:val="24"/>
-          <w:szCs w:val="24"/>
-          <w:lang w:eastAsia="zh-TW"/>
-        </w:rPr>
-        <w:t>角</w:t>
-      </w:r>
-      <w:r>
-        <w:rPr>
-          <w:rFonts w:ascii="Noto Serif" w:eastAsia="Noto Serif SC" w:hAnsi="Noto Serif" w:cs="Noto Serif"/>
-          <w:sz w:val="24"/>
-          <w:szCs w:val="24"/>
-          <w:lang w:eastAsia="zh-TW"/>
-        </w:rPr>
-        <w:t>)</w:t>
-      </w:r>
-      <w:r>
-        <w:rPr>
-          <w:rFonts w:ascii="Noto Serif" w:eastAsia="Noto Serif SC" w:hAnsi="Noto Serif" w:cs="Noto Serif"/>
-          <w:sz w:val="24"/>
-          <w:szCs w:val="24"/>
-          <w:lang w:eastAsia="zh-TW"/>
-        </w:rPr>
-        <w:t>.</w:t>
-      </w:r>
-      <w:r>
-        <w:rPr>
-          <w:rFonts w:ascii="Noto Serif" w:eastAsia="Noto Serif SC" w:hAnsi="Noto Serif" w:cs="Noto Serif"/>
-          <w:sz w:val="24"/>
-          <w:szCs w:val="24"/>
-          <w:lang w:eastAsia="zh-TW"/>
+          <w:lang w:val="en-GB" w:eastAsia="zh-TW"/>
+        </w:rPr>
+        <w:t>To</w:t>
+      </w:r>
+      <w:r>
+        <w:rPr>
+          <w:rFonts w:ascii="Noto Serif" w:eastAsia="Noto Serif SC" w:hAnsi="Noto Serif" w:cs="Noto Serif"/>
+          <w:sz w:val="24"/>
+          <w:szCs w:val="24"/>
+          <w:lang w:val="en-GB" w:eastAsia="zh-TW"/>
+        </w:rPr>
+        <w:t xml:space="preserve"> imitate the nine actors</w:t>
+      </w:r>
+      <w:r>
+        <w:rPr>
+          <w:rFonts w:ascii="Noto Serif" w:eastAsia="Noto Serif SC" w:hAnsi="Noto Serif" w:cs="Noto Serif"/>
+          <w:sz w:val="24"/>
+          <w:szCs w:val="24"/>
+          <w:lang w:val="en-GB" w:eastAsia="zh-TW"/>
+        </w:rPr>
+        <w:t xml:space="preserve"> in this piece</w:t>
+      </w:r>
+      <w:r>
+        <w:rPr>
+          <w:rFonts w:ascii="Noto Serif" w:eastAsia="Noto Serif SC" w:hAnsi="Noto Serif" w:cs="Noto Serif"/>
+          <w:sz w:val="24"/>
+          <w:szCs w:val="24"/>
+          <w:lang w:val="en-GB" w:eastAsia="zh-TW"/>
+        </w:rPr>
+        <w:t>,</w:t>
+      </w:r>
+      <w:r>
+        <w:rPr>
+          <w:rFonts w:ascii="Noto Serif" w:eastAsia="Noto Serif SC" w:hAnsi="Noto Serif" w:cs="Noto Serif"/>
+          <w:sz w:val="24"/>
+          <w:szCs w:val="24"/>
+          <w:lang w:val="en-GB" w:eastAsia="zh-TW"/>
         </w:rPr>
         <w:t xml:space="preserve"> </w:t>
       </w:r>
@@ -2867,34 +2966,34 @@
           <w:szCs w:val="24"/>
           <w:lang w:val="en-GB" w:eastAsia="zh-TW"/>
         </w:rPr>
-        <w:t>To</w:t>
-      </w:r>
-      <w:r>
-        <w:rPr>
-          <w:rFonts w:ascii="Noto Serif" w:eastAsia="Noto Serif SC" w:hAnsi="Noto Serif" w:cs="Noto Serif"/>
-          <w:sz w:val="24"/>
-          <w:szCs w:val="24"/>
-          <w:lang w:val="en-GB" w:eastAsia="zh-TW"/>
-        </w:rPr>
-        <w:t xml:space="preserve"> imitate the nine actors</w:t>
-      </w:r>
-      <w:r>
-        <w:rPr>
-          <w:rFonts w:ascii="Noto Serif" w:eastAsia="Noto Serif SC" w:hAnsi="Noto Serif" w:cs="Noto Serif"/>
-          <w:sz w:val="24"/>
-          <w:szCs w:val="24"/>
-          <w:lang w:val="en-GB" w:eastAsia="zh-TW"/>
-        </w:rPr>
-        <w:t xml:space="preserve"> in this piece</w:t>
-      </w:r>
-      <w:r>
-        <w:rPr>
-          <w:rFonts w:ascii="Noto Serif" w:eastAsia="Noto Serif SC" w:hAnsi="Noto Serif" w:cs="Noto Serif"/>
-          <w:sz w:val="24"/>
-          <w:szCs w:val="24"/>
-          <w:lang w:val="en-GB" w:eastAsia="zh-TW"/>
-        </w:rPr>
-        <w:t>,</w:t>
+        <w:t xml:space="preserve">the composer has assigned nine traditional </w:t>
+      </w:r>
+      <w:r>
+        <w:rPr>
+          <w:rFonts w:ascii="Noto Serif" w:eastAsia="Noto Serif SC" w:hAnsi="Noto Serif" w:cs="Noto Serif"/>
+          <w:sz w:val="24"/>
+          <w:szCs w:val="24"/>
+          <w:lang w:val="en-GB" w:eastAsia="zh-TW"/>
+        </w:rPr>
+        <w:t xml:space="preserve">Teochew </w:t>
+      </w:r>
+      <w:r>
+        <w:rPr>
+          <w:rFonts w:ascii="Noto Serif" w:eastAsia="Noto Serif SC" w:hAnsi="Noto Serif" w:cs="Noto Serif"/>
+          <w:sz w:val="24"/>
+          <w:szCs w:val="24"/>
+          <w:lang w:val="en-GB" w:eastAsia="zh-TW"/>
+        </w:rPr>
+        <w:t>instruments</w:t>
+      </w:r>
+      <w:r>
+        <w:rPr>
+          <w:rFonts w:ascii="Noto Serif" w:eastAsia="Noto Serif SC" w:hAnsi="Noto Serif" w:cs="Noto Serif"/>
+          <w:sz w:val="24"/>
+          <w:szCs w:val="24"/>
+          <w:lang w:val="en-GB" w:eastAsia="zh-TW"/>
+        </w:rPr>
+        <w:t xml:space="preserve"> (or instrument groups)</w:t>
       </w:r>
       <w:r>
         <w:rPr>
@@ -2912,51 +3011,6 @@
           <w:szCs w:val="24"/>
           <w:lang w:val="en-GB" w:eastAsia="zh-TW"/>
         </w:rPr>
-        <w:t xml:space="preserve">the composer has assigned nine traditional </w:t>
-      </w:r>
-      <w:r>
-        <w:rPr>
-          <w:rFonts w:ascii="Noto Serif" w:eastAsia="Noto Serif SC" w:hAnsi="Noto Serif" w:cs="Noto Serif"/>
-          <w:sz w:val="24"/>
-          <w:szCs w:val="24"/>
-          <w:lang w:val="en-GB" w:eastAsia="zh-TW"/>
-        </w:rPr>
-        <w:t xml:space="preserve">Teochew </w:t>
-      </w:r>
-      <w:r>
-        <w:rPr>
-          <w:rFonts w:ascii="Noto Serif" w:eastAsia="Noto Serif SC" w:hAnsi="Noto Serif" w:cs="Noto Serif"/>
-          <w:sz w:val="24"/>
-          <w:szCs w:val="24"/>
-          <w:lang w:val="en-GB" w:eastAsia="zh-TW"/>
-        </w:rPr>
-        <w:t>instruments</w:t>
-      </w:r>
-      <w:r>
-        <w:rPr>
-          <w:rFonts w:ascii="Noto Serif" w:eastAsia="Noto Serif SC" w:hAnsi="Noto Serif" w:cs="Noto Serif"/>
-          <w:sz w:val="24"/>
-          <w:szCs w:val="24"/>
-          <w:lang w:val="en-GB" w:eastAsia="zh-TW"/>
-        </w:rPr>
-        <w:t xml:space="preserve"> (or instrument groups)</w:t>
-      </w:r>
-      <w:r>
-        <w:rPr>
-          <w:rFonts w:ascii="Noto Serif" w:eastAsia="Noto Serif SC" w:hAnsi="Noto Serif" w:cs="Noto Serif"/>
-          <w:sz w:val="24"/>
-          <w:szCs w:val="24"/>
-          <w:lang w:val="en-GB" w:eastAsia="zh-TW"/>
-        </w:rPr>
-        <w:t xml:space="preserve"> </w:t>
-      </w:r>
-      <w:r>
-        <w:rPr>
-          <w:rFonts w:ascii="Noto Serif" w:eastAsia="Noto Serif SC" w:hAnsi="Noto Serif" w:cs="Noto Serif"/>
-          <w:sz w:val="24"/>
-          <w:szCs w:val="24"/>
-          <w:lang w:val="en-GB" w:eastAsia="zh-TW"/>
-        </w:rPr>
         <w:t xml:space="preserve">to represent </w:t>
       </w:r>
       <w:r>
@@ -3004,14 +3058,25 @@
         </w:rPr>
         <w:t xml:space="preserve"> the </w:t>
       </w:r>
-      <w:r>
-        <w:rPr>
-          <w:rFonts w:ascii="Noto Serif" w:eastAsia="Noto Serif SC" w:hAnsi="Noto Serif" w:cs="Noto Serif"/>
-          <w:sz w:val="24"/>
-          <w:szCs w:val="24"/>
-          <w:lang w:val="en-GB" w:eastAsia="zh-TW"/>
-        </w:rPr>
-        <w:t>suona, “drum and gong” ensemble, flute and woodwind</w:t>
+      <w:proofErr w:type="spellStart"/>
+      <w:r>
+        <w:rPr>
+          <w:rFonts w:ascii="Noto Serif" w:eastAsia="Noto Serif SC" w:hAnsi="Noto Serif" w:cs="Noto Serif"/>
+          <w:sz w:val="24"/>
+          <w:szCs w:val="24"/>
+          <w:lang w:val="en-GB" w:eastAsia="zh-TW"/>
+        </w:rPr>
+        <w:t>suona</w:t>
+      </w:r>
+      <w:proofErr w:type="spellEnd"/>
+      <w:r>
+        <w:rPr>
+          <w:rFonts w:ascii="Noto Serif" w:eastAsia="Noto Serif SC" w:hAnsi="Noto Serif" w:cs="Noto Serif"/>
+          <w:sz w:val="24"/>
+          <w:szCs w:val="24"/>
+          <w:lang w:val="en-GB" w:eastAsia="zh-TW"/>
+        </w:rPr>
+        <w:t>, “drum and gong” ensemble, flute and woodwind</w:t>
       </w:r>
       <w:r>
         <w:rPr>
@@ -3861,7 +3926,27 @@
           <w:szCs w:val="24"/>
           <w:lang w:val="en-GB" w:eastAsia="zh-TW"/>
         </w:rPr>
-        <w:t xml:space="preserve"> (Bangdi)</w:t>
+        <w:t xml:space="preserve"> (</w:t>
+      </w:r>
+      <w:proofErr w:type="spellStart"/>
+      <w:r>
+        <w:rPr>
+          <w:rFonts w:ascii="Noto Serif" w:eastAsia="Noto Serif SC" w:hAnsi="Noto Serif" w:cs="Noto Serif"/>
+          <w:sz w:val="24"/>
+          <w:szCs w:val="24"/>
+          <w:lang w:val="en-GB" w:eastAsia="zh-TW"/>
+        </w:rPr>
+        <w:t>Bangdi</w:t>
+      </w:r>
+      <w:proofErr w:type="spellEnd"/>
+      <w:r>
+        <w:rPr>
+          <w:rFonts w:ascii="Noto Serif" w:eastAsia="Noto Serif SC" w:hAnsi="Noto Serif" w:cs="Noto Serif"/>
+          <w:sz w:val="24"/>
+          <w:szCs w:val="24"/>
+          <w:lang w:val="en-GB" w:eastAsia="zh-TW"/>
+        </w:rPr>
+        <w:t>)</w:t>
       </w:r>
     </w:p>
     <w:p>
@@ -3890,7 +3975,27 @@
           <w:szCs w:val="24"/>
           <w:lang w:val="en-US" w:eastAsia="zh-TW"/>
         </w:rPr>
-        <w:t xml:space="preserve"> (Qudi)</w:t>
+        <w:t xml:space="preserve"> (</w:t>
+      </w:r>
+      <w:proofErr w:type="spellStart"/>
+      <w:r>
+        <w:rPr>
+          <w:rFonts w:ascii="Noto Serif" w:eastAsia="Noto Serif SC" w:hAnsi="Noto Serif" w:cs="Noto Serif"/>
+          <w:sz w:val="24"/>
+          <w:szCs w:val="24"/>
+          <w:lang w:val="en-US" w:eastAsia="zh-TW"/>
+        </w:rPr>
+        <w:t>Qudi</w:t>
+      </w:r>
+      <w:proofErr w:type="spellEnd"/>
+      <w:r>
+        <w:rPr>
+          <w:rFonts w:ascii="Noto Serif" w:eastAsia="Noto Serif SC" w:hAnsi="Noto Serif" w:cs="Noto Serif"/>
+          <w:sz w:val="24"/>
+          <w:szCs w:val="24"/>
+          <w:lang w:val="en-US" w:eastAsia="zh-TW"/>
+        </w:rPr>
+        <w:t>)</w:t>
       </w:r>
     </w:p>
     <w:p>
@@ -3919,7 +4024,27 @@
           <w:szCs w:val="24"/>
           <w:lang w:val="en-GB" w:eastAsia="zh-TW"/>
         </w:rPr>
-        <w:t xml:space="preserve"> I (Xindi)</w:t>
+        <w:t xml:space="preserve"> I (</w:t>
+      </w:r>
+      <w:proofErr w:type="spellStart"/>
+      <w:r>
+        <w:rPr>
+          <w:rFonts w:ascii="Noto Serif" w:eastAsia="Noto Serif SC" w:hAnsi="Noto Serif" w:cs="Noto Serif"/>
+          <w:sz w:val="24"/>
+          <w:szCs w:val="24"/>
+          <w:lang w:val="en-GB" w:eastAsia="zh-TW"/>
+        </w:rPr>
+        <w:t>Xindi</w:t>
+      </w:r>
+      <w:proofErr w:type="spellEnd"/>
+      <w:r>
+        <w:rPr>
+          <w:rFonts w:ascii="Noto Serif" w:eastAsia="Noto Serif SC" w:hAnsi="Noto Serif" w:cs="Noto Serif"/>
+          <w:sz w:val="24"/>
+          <w:szCs w:val="24"/>
+          <w:lang w:val="en-GB" w:eastAsia="zh-TW"/>
+        </w:rPr>
+        <w:t>)</w:t>
       </w:r>
     </w:p>
     <w:p>
@@ -3959,7 +4084,27 @@
           <w:szCs w:val="24"/>
           <w:lang w:val="en-GB" w:eastAsia="zh-TW"/>
         </w:rPr>
-        <w:t xml:space="preserve"> (Gaoyin Sheng)</w:t>
+        <w:t xml:space="preserve"> (</w:t>
+      </w:r>
+      <w:proofErr w:type="spellStart"/>
+      <w:r>
+        <w:rPr>
+          <w:rFonts w:ascii="Noto Serif" w:eastAsia="Noto Serif SC" w:hAnsi="Noto Serif" w:cs="Noto Serif"/>
+          <w:sz w:val="24"/>
+          <w:szCs w:val="24"/>
+          <w:lang w:val="en-GB" w:eastAsia="zh-TW"/>
+        </w:rPr>
+        <w:t>Gaoyin</w:t>
+      </w:r>
+      <w:proofErr w:type="spellEnd"/>
+      <w:r>
+        <w:rPr>
+          <w:rFonts w:ascii="Noto Serif" w:eastAsia="Noto Serif SC" w:hAnsi="Noto Serif" w:cs="Noto Serif"/>
+          <w:sz w:val="24"/>
+          <w:szCs w:val="24"/>
+          <w:lang w:val="en-GB" w:eastAsia="zh-TW"/>
+        </w:rPr>
+        <w:t xml:space="preserve"> Sheng)</w:t>
       </w:r>
     </w:p>
     <w:p>
@@ -3988,7 +4133,27 @@
           <w:szCs w:val="24"/>
           <w:lang w:val="en-GB" w:eastAsia="zh-TW"/>
         </w:rPr>
-        <w:t xml:space="preserve"> (Zhongyin Sheng)</w:t>
+        <w:t xml:space="preserve"> (</w:t>
+      </w:r>
+      <w:proofErr w:type="spellStart"/>
+      <w:r>
+        <w:rPr>
+          <w:rFonts w:ascii="Noto Serif" w:eastAsia="Noto Serif SC" w:hAnsi="Noto Serif" w:cs="Noto Serif"/>
+          <w:sz w:val="24"/>
+          <w:szCs w:val="24"/>
+          <w:lang w:val="en-GB" w:eastAsia="zh-TW"/>
+        </w:rPr>
+        <w:t>Zhongyin</w:t>
+      </w:r>
+      <w:proofErr w:type="spellEnd"/>
+      <w:r>
+        <w:rPr>
+          <w:rFonts w:ascii="Noto Serif" w:eastAsia="Noto Serif SC" w:hAnsi="Noto Serif" w:cs="Noto Serif"/>
+          <w:sz w:val="24"/>
+          <w:szCs w:val="24"/>
+          <w:lang w:val="en-GB" w:eastAsia="zh-TW"/>
+        </w:rPr>
+        <w:t xml:space="preserve"> Sheng)</w:t>
       </w:r>
     </w:p>
     <w:p>
@@ -4066,7 +4231,47 @@
           <w:szCs w:val="24"/>
           <w:lang w:val="en-GB" w:eastAsia="zh-TW"/>
         </w:rPr>
-        <w:t xml:space="preserve"> (Gaoyin Suona)</w:t>
+        <w:t xml:space="preserve"> (</w:t>
+      </w:r>
+      <w:proofErr w:type="spellStart"/>
+      <w:r>
+        <w:rPr>
+          <w:rFonts w:ascii="Noto Serif" w:eastAsia="Noto Serif SC" w:hAnsi="Noto Serif" w:cs="Noto Serif"/>
+          <w:sz w:val="24"/>
+          <w:szCs w:val="24"/>
+          <w:lang w:val="en-GB" w:eastAsia="zh-TW"/>
+        </w:rPr>
+        <w:t>Gaoyin</w:t>
+      </w:r>
+      <w:proofErr w:type="spellEnd"/>
+      <w:r>
+        <w:rPr>
+          <w:rFonts w:ascii="Noto Serif" w:eastAsia="Noto Serif SC" w:hAnsi="Noto Serif" w:cs="Noto Serif"/>
+          <w:sz w:val="24"/>
+          <w:szCs w:val="24"/>
+          <w:lang w:val="en-GB" w:eastAsia="zh-TW"/>
+        </w:rPr>
+        <w:t xml:space="preserve"> </w:t>
+      </w:r>
+      <w:proofErr w:type="spellStart"/>
+      <w:r>
+        <w:rPr>
+          <w:rFonts w:ascii="Noto Serif" w:eastAsia="Noto Serif SC" w:hAnsi="Noto Serif" w:cs="Noto Serif"/>
+          <w:sz w:val="24"/>
+          <w:szCs w:val="24"/>
+          <w:lang w:val="en-GB" w:eastAsia="zh-TW"/>
+        </w:rPr>
+        <w:t>Suona</w:t>
+      </w:r>
+      <w:proofErr w:type="spellEnd"/>
+      <w:r>
+        <w:rPr>
+          <w:rFonts w:ascii="Noto Serif" w:eastAsia="Noto Serif SC" w:hAnsi="Noto Serif" w:cs="Noto Serif"/>
+          <w:sz w:val="24"/>
+          <w:szCs w:val="24"/>
+          <w:lang w:val="en-GB" w:eastAsia="zh-TW"/>
+        </w:rPr>
+        <w:t>)</w:t>
       </w:r>
     </w:p>
     <w:p>
@@ -4095,7 +4300,67 @@
           <w:szCs w:val="24"/>
           <w:lang w:val="en-US" w:eastAsia="zh-TW"/>
         </w:rPr>
-        <w:t xml:space="preserve"> (Jiajian Zhongyin Suona)</w:t>
+        <w:t xml:space="preserve"> (</w:t>
+      </w:r>
+      <w:proofErr w:type="spellStart"/>
+      <w:r>
+        <w:rPr>
+          <w:rFonts w:ascii="Noto Serif" w:eastAsia="Noto Serif SC" w:hAnsi="Noto Serif" w:cs="Noto Serif"/>
+          <w:sz w:val="24"/>
+          <w:szCs w:val="24"/>
+          <w:lang w:val="en-US" w:eastAsia="zh-TW"/>
+        </w:rPr>
+        <w:t>Jiajian</w:t>
+      </w:r>
+      <w:proofErr w:type="spellEnd"/>
+      <w:r>
+        <w:rPr>
+          <w:rFonts w:ascii="Noto Serif" w:eastAsia="Noto Serif SC" w:hAnsi="Noto Serif" w:cs="Noto Serif"/>
+          <w:sz w:val="24"/>
+          <w:szCs w:val="24"/>
+          <w:lang w:val="en-US" w:eastAsia="zh-TW"/>
+        </w:rPr>
+        <w:t xml:space="preserve"> </w:t>
+      </w:r>
+      <w:proofErr w:type="spellStart"/>
+      <w:r>
+        <w:rPr>
+          <w:rFonts w:ascii="Noto Serif" w:eastAsia="Noto Serif SC" w:hAnsi="Noto Serif" w:cs="Noto Serif"/>
+          <w:sz w:val="24"/>
+          <w:szCs w:val="24"/>
+          <w:lang w:val="en-US" w:eastAsia="zh-TW"/>
+        </w:rPr>
+        <w:t>Zhongyin</w:t>
+      </w:r>
+      <w:proofErr w:type="spellEnd"/>
+      <w:r>
+        <w:rPr>
+          <w:rFonts w:ascii="Noto Serif" w:eastAsia="Noto Serif SC" w:hAnsi="Noto Serif" w:cs="Noto Serif"/>
+          <w:sz w:val="24"/>
+          <w:szCs w:val="24"/>
+          <w:lang w:val="en-US" w:eastAsia="zh-TW"/>
+        </w:rPr>
+        <w:t xml:space="preserve"> </w:t>
+      </w:r>
+      <w:proofErr w:type="spellStart"/>
+      <w:r>
+        <w:rPr>
+          <w:rFonts w:ascii="Noto Serif" w:eastAsia="Noto Serif SC" w:hAnsi="Noto Serif" w:cs="Noto Serif"/>
+          <w:sz w:val="24"/>
+          <w:szCs w:val="24"/>
+          <w:lang w:val="en-US" w:eastAsia="zh-TW"/>
+        </w:rPr>
+        <w:t>Suona</w:t>
+      </w:r>
+      <w:proofErr w:type="spellEnd"/>
+      <w:r>
+        <w:rPr>
+          <w:rFonts w:ascii="Noto Serif" w:eastAsia="Noto Serif SC" w:hAnsi="Noto Serif" w:cs="Noto Serif"/>
+          <w:sz w:val="24"/>
+          <w:szCs w:val="24"/>
+          <w:lang w:val="en-US" w:eastAsia="zh-TW"/>
+        </w:rPr>
+        <w:t>)</w:t>
       </w:r>
     </w:p>
     <w:p>
@@ -4124,25 +4389,67 @@
           <w:szCs w:val="24"/>
           <w:lang w:val="en-US" w:eastAsia="zh-TW"/>
         </w:rPr>
-        <w:t xml:space="preserve"> (Jiajian </w:t>
-      </w:r>
-      <w:r>
-        <w:rPr>
-          <w:rFonts w:ascii="Noto Serif" w:eastAsia="Noto Serif SC" w:hAnsi="Noto Serif" w:cs="Noto Serif"/>
-          <w:sz w:val="24"/>
-          <w:szCs w:val="24"/>
-          <w:lang w:eastAsia="zh-TW"/>
-        </w:rPr>
-        <w:t xml:space="preserve">Cizhongyin </w:t>
-      </w:r>
-      <w:r>
-        <w:rPr>
-          <w:rFonts w:ascii="Noto Serif" w:eastAsia="Noto Serif SC" w:hAnsi="Noto Serif" w:cs="Noto Serif"/>
-          <w:sz w:val="24"/>
-          <w:szCs w:val="24"/>
-          <w:lang w:val="en-US" w:eastAsia="zh-TW"/>
-        </w:rPr>
-        <w:t>Suona)</w:t>
+        <w:t xml:space="preserve"> (</w:t>
+      </w:r>
+      <w:proofErr w:type="spellStart"/>
+      <w:r>
+        <w:rPr>
+          <w:rFonts w:ascii="Noto Serif" w:eastAsia="Noto Serif SC" w:hAnsi="Noto Serif" w:cs="Noto Serif"/>
+          <w:sz w:val="24"/>
+          <w:szCs w:val="24"/>
+          <w:lang w:val="en-US" w:eastAsia="zh-TW"/>
+        </w:rPr>
+        <w:t>Jiajian</w:t>
+      </w:r>
+      <w:proofErr w:type="spellEnd"/>
+      <w:r>
+        <w:rPr>
+          <w:rFonts w:ascii="Noto Serif" w:eastAsia="Noto Serif SC" w:hAnsi="Noto Serif" w:cs="Noto Serif"/>
+          <w:sz w:val="24"/>
+          <w:szCs w:val="24"/>
+          <w:lang w:val="en-US" w:eastAsia="zh-TW"/>
+        </w:rPr>
+        <w:t xml:space="preserve"> </w:t>
+      </w:r>
+      <w:proofErr w:type="spellStart"/>
+      <w:r>
+        <w:rPr>
+          <w:rFonts w:ascii="Noto Serif" w:eastAsia="Noto Serif SC" w:hAnsi="Noto Serif" w:cs="Noto Serif"/>
+          <w:sz w:val="24"/>
+          <w:szCs w:val="24"/>
+          <w:lang w:eastAsia="zh-TW"/>
+        </w:rPr>
+        <w:t>Cizhongyin</w:t>
+      </w:r>
+      <w:proofErr w:type="spellEnd"/>
+      <w:r>
+        <w:rPr>
+          <w:rFonts w:ascii="Noto Serif" w:eastAsia="Noto Serif SC" w:hAnsi="Noto Serif" w:cs="Noto Serif"/>
+          <w:sz w:val="24"/>
+          <w:szCs w:val="24"/>
+          <w:lang w:eastAsia="zh-TW"/>
+        </w:rPr>
+        <w:t xml:space="preserve"> </w:t>
+      </w:r>
+      <w:proofErr w:type="spellStart"/>
+      <w:r>
+        <w:rPr>
+          <w:rFonts w:ascii="Noto Serif" w:eastAsia="Noto Serif SC" w:hAnsi="Noto Serif" w:cs="Noto Serif"/>
+          <w:sz w:val="24"/>
+          <w:szCs w:val="24"/>
+          <w:lang w:val="en-US" w:eastAsia="zh-TW"/>
+        </w:rPr>
+        <w:t>Suona</w:t>
+      </w:r>
+      <w:proofErr w:type="spellEnd"/>
+      <w:r>
+        <w:rPr>
+          <w:rFonts w:ascii="Noto Serif" w:eastAsia="Noto Serif SC" w:hAnsi="Noto Serif" w:cs="Noto Serif"/>
+          <w:sz w:val="24"/>
+          <w:szCs w:val="24"/>
+          <w:lang w:val="en-US" w:eastAsia="zh-TW"/>
+        </w:rPr>
+        <w:t>)</w:t>
       </w:r>
     </w:p>
     <w:p>
@@ -4189,8 +4496,19 @@
           <w:szCs w:val="24"/>
           <w:lang w:eastAsia="zh-TW"/>
         </w:rPr>
-        <w:t>Diyin Suona</w:t>
-      </w:r>
+        <w:t xml:space="preserve">Diyin </w:t>
+      </w:r>
+      <w:proofErr w:type="spellStart"/>
+      <w:r>
+        <w:rPr>
+          <w:rFonts w:ascii="Noto Serif" w:eastAsia="Noto Serif SC" w:hAnsi="Noto Serif" w:cs="Noto Serif"/>
+          <w:sz w:val="24"/>
+          <w:szCs w:val="24"/>
+          <w:lang w:eastAsia="zh-TW"/>
+        </w:rPr>
+        <w:t>Suona</w:t>
+      </w:r>
+      <w:proofErr w:type="spellEnd"/>
       <w:r>
         <w:rPr>
           <w:rFonts w:ascii="Noto Serif" w:eastAsia="Noto Serif SC" w:hAnsi="Noto Serif" w:cs="Noto Serif"/>
@@ -4216,7 +4534,7 @@
       <w:pPr>
         <w:jc w:val="right"/>
         <w:rPr>
-          <w:rFonts w:ascii="Noto Serif" w:eastAsia="Noto Serif SC" w:hAnsi="Noto Serif" w:cs="Noto Serif" w:hint="eastAsia"/>
+          <w:rFonts w:ascii="Noto Serif" w:eastAsia="Noto Serif SC" w:hAnsi="Noto Serif" w:cs="Noto Serif"/>
           <w:sz w:val="24"/>
           <w:szCs w:val="24"/>
           <w:lang w:val="en-US"/>
@@ -4307,7 +4625,27 @@
           <w:szCs w:val="24"/>
           <w:lang w:val="en-US" w:eastAsia="zh-TW"/>
         </w:rPr>
-        <w:t xml:space="preserve"> (Liuqin)</w:t>
+        <w:t xml:space="preserve"> (</w:t>
+      </w:r>
+      <w:proofErr w:type="spellStart"/>
+      <w:r>
+        <w:rPr>
+          <w:rFonts w:ascii="Noto Serif" w:eastAsia="Noto Serif SC" w:hAnsi="Noto Serif" w:cs="Noto Serif"/>
+          <w:sz w:val="24"/>
+          <w:szCs w:val="24"/>
+          <w:lang w:val="en-US" w:eastAsia="zh-TW"/>
+        </w:rPr>
+        <w:t>Liuqin</w:t>
+      </w:r>
+      <w:proofErr w:type="spellEnd"/>
+      <w:r>
+        <w:rPr>
+          <w:rFonts w:ascii="Noto Serif" w:eastAsia="Noto Serif SC" w:hAnsi="Noto Serif" w:cs="Noto Serif"/>
+          <w:sz w:val="24"/>
+          <w:szCs w:val="24"/>
+          <w:lang w:val="en-US" w:eastAsia="zh-TW"/>
+        </w:rPr>
+        <w:t>)</w:t>
       </w:r>
     </w:p>
     <w:p>
@@ -4372,7 +4710,7 @@
       <w:pPr>
         <w:jc w:val="right"/>
         <w:rPr>
-          <w:rFonts w:ascii="Noto Serif" w:eastAsia="Noto Serif SC" w:hAnsi="Noto Serif" w:cs="Noto Serif" w:hint="eastAsia"/>
+          <w:rFonts w:ascii="Noto Serif" w:eastAsia="Noto Serif SC" w:hAnsi="Noto Serif" w:cs="Noto Serif"/>
           <w:sz w:val="24"/>
           <w:szCs w:val="24"/>
           <w:lang w:val="en-US"/>
@@ -4510,7 +4848,7 @@
       <w:pPr>
         <w:jc w:val="right"/>
         <w:rPr>
-          <w:rFonts w:ascii="Noto Serif" w:eastAsia="Noto Serif SC" w:hAnsi="Noto Serif" w:cs="Noto Serif" w:hint="eastAsia"/>
+          <w:rFonts w:ascii="Noto Serif" w:eastAsia="Noto Serif SC" w:hAnsi="Noto Serif" w:cs="Noto Serif"/>
           <w:sz w:val="20"/>
           <w:szCs w:val="20"/>
           <w:lang w:val="en-US"/>
@@ -4568,15 +4906,35 @@
           <w:szCs w:val="20"/>
           <w:lang w:eastAsia="zh-TW"/>
         </w:rPr>
-        <w:t xml:space="preserve"> (Xiaogu), </w:t>
-      </w:r>
-      <w:r>
-        <w:rPr>
-          <w:rFonts w:ascii="Noto Serif" w:eastAsia="Noto Serif SC" w:hAnsi="Noto Serif" w:cs="Noto Serif" w:hint="eastAsia"/>
+        <w:t xml:space="preserve"> (</w:t>
+      </w:r>
+      <w:proofErr w:type="spellStart"/>
+      <w:r>
+        <w:rPr>
+          <w:rFonts w:ascii="Noto Serif" w:eastAsia="Noto Serif SC" w:hAnsi="Noto Serif" w:cs="Noto Serif"/>
           <w:sz w:val="20"/>
           <w:szCs w:val="20"/>
           <w:lang w:eastAsia="zh-TW"/>
         </w:rPr>
+        <w:t>Xiaogu</w:t>
+      </w:r>
+      <w:proofErr w:type="spellEnd"/>
+      <w:r>
+        <w:rPr>
+          <w:rFonts w:ascii="Noto Serif" w:eastAsia="Noto Serif SC" w:hAnsi="Noto Serif" w:cs="Noto Serif"/>
+          <w:sz w:val="20"/>
+          <w:szCs w:val="20"/>
+          <w:lang w:eastAsia="zh-TW"/>
+        </w:rPr>
+        <w:t xml:space="preserve">), </w:t>
+      </w:r>
+      <w:r>
+        <w:rPr>
+          <w:rFonts w:ascii="Noto Serif" w:eastAsia="Noto Serif SC" w:hAnsi="Noto Serif" w:cs="Noto Serif" w:hint="eastAsia"/>
+          <w:sz w:val="20"/>
+          <w:szCs w:val="20"/>
+          <w:lang w:eastAsia="zh-TW"/>
+        </w:rPr>
         <w:t>排鼓</w:t>
       </w:r>
       <w:r>
@@ -4586,7 +4944,27 @@
           <w:szCs w:val="20"/>
           <w:lang w:eastAsia="zh-TW"/>
         </w:rPr>
-        <w:t xml:space="preserve"> (Paigu)</w:t>
+        <w:t xml:space="preserve"> (</w:t>
+      </w:r>
+      <w:proofErr w:type="spellStart"/>
+      <w:r>
+        <w:rPr>
+          <w:rFonts w:ascii="Noto Serif" w:eastAsia="Noto Serif SC" w:hAnsi="Noto Serif" w:cs="Noto Serif"/>
+          <w:sz w:val="20"/>
+          <w:szCs w:val="20"/>
+          <w:lang w:eastAsia="zh-TW"/>
+        </w:rPr>
+        <w:t>Paigu</w:t>
+      </w:r>
+      <w:proofErr w:type="spellEnd"/>
+      <w:r>
+        <w:rPr>
+          <w:rFonts w:ascii="Noto Serif" w:eastAsia="Noto Serif SC" w:hAnsi="Noto Serif" w:cs="Noto Serif"/>
+          <w:sz w:val="20"/>
+          <w:szCs w:val="20"/>
+          <w:lang w:eastAsia="zh-TW"/>
+        </w:rPr>
+        <w:t>)</w:t>
       </w:r>
     </w:p>
     <w:p>
@@ -4633,15 +5011,35 @@
           <w:szCs w:val="20"/>
           <w:lang w:eastAsia="zh-TW"/>
         </w:rPr>
-        <w:t xml:space="preserve"> (Nanbangzi), </w:t>
-      </w:r>
-      <w:r>
-        <w:rPr>
-          <w:rFonts w:ascii="Noto Serif" w:eastAsia="Noto Serif SC" w:hAnsi="Noto Serif" w:cs="Noto Serif" w:hint="eastAsia"/>
+        <w:t xml:space="preserve"> (</w:t>
+      </w:r>
+      <w:proofErr w:type="spellStart"/>
+      <w:r>
+        <w:rPr>
+          <w:rFonts w:ascii="Noto Serif" w:eastAsia="Noto Serif SC" w:hAnsi="Noto Serif" w:cs="Noto Serif"/>
           <w:sz w:val="20"/>
           <w:szCs w:val="20"/>
           <w:lang w:eastAsia="zh-TW"/>
         </w:rPr>
+        <w:t>Nanbangzi</w:t>
+      </w:r>
+      <w:proofErr w:type="spellEnd"/>
+      <w:r>
+        <w:rPr>
+          <w:rFonts w:ascii="Noto Serif" w:eastAsia="Noto Serif SC" w:hAnsi="Noto Serif" w:cs="Noto Serif"/>
+          <w:sz w:val="20"/>
+          <w:szCs w:val="20"/>
+          <w:lang w:eastAsia="zh-TW"/>
+        </w:rPr>
+        <w:t xml:space="preserve">), </w:t>
+      </w:r>
+      <w:r>
+        <w:rPr>
+          <w:rFonts w:ascii="Noto Serif" w:eastAsia="Noto Serif SC" w:hAnsi="Noto Serif" w:cs="Noto Serif" w:hint="eastAsia"/>
+          <w:sz w:val="20"/>
+          <w:szCs w:val="20"/>
+          <w:lang w:eastAsia="zh-TW"/>
+        </w:rPr>
         <w:t>木魚</w:t>
       </w:r>
       <w:r>
@@ -4669,15 +5067,35 @@
           <w:szCs w:val="20"/>
           <w:lang w:eastAsia="zh-TW"/>
         </w:rPr>
-        <w:t xml:space="preserve"> (Paigu), </w:t>
-      </w:r>
-      <w:r>
-        <w:rPr>
-          <w:rFonts w:ascii="Noto Serif" w:eastAsia="Noto Serif SC" w:hAnsi="Noto Serif" w:cs="Noto Serif" w:hint="eastAsia"/>
+        <w:t xml:space="preserve"> (</w:t>
+      </w:r>
+      <w:proofErr w:type="spellStart"/>
+      <w:r>
+        <w:rPr>
+          <w:rFonts w:ascii="Noto Serif" w:eastAsia="Noto Serif SC" w:hAnsi="Noto Serif" w:cs="Noto Serif"/>
           <w:sz w:val="20"/>
           <w:szCs w:val="20"/>
           <w:lang w:eastAsia="zh-TW"/>
         </w:rPr>
+        <w:t>Paigu</w:t>
+      </w:r>
+      <w:proofErr w:type="spellEnd"/>
+      <w:r>
+        <w:rPr>
+          <w:rFonts w:ascii="Noto Serif" w:eastAsia="Noto Serif SC" w:hAnsi="Noto Serif" w:cs="Noto Serif"/>
+          <w:sz w:val="20"/>
+          <w:szCs w:val="20"/>
+          <w:lang w:eastAsia="zh-TW"/>
+        </w:rPr>
+        <w:t xml:space="preserve">), </w:t>
+      </w:r>
+      <w:r>
+        <w:rPr>
+          <w:rFonts w:ascii="Noto Serif" w:eastAsia="Noto Serif SC" w:hAnsi="Noto Serif" w:cs="Noto Serif" w:hint="eastAsia"/>
+          <w:sz w:val="20"/>
+          <w:szCs w:val="20"/>
+          <w:lang w:eastAsia="zh-TW"/>
+        </w:rPr>
         <w:t>拍板</w:t>
       </w:r>
       <w:r>
@@ -4733,15 +5151,33 @@
           <w:szCs w:val="20"/>
           <w:lang w:eastAsia="zh-TW"/>
         </w:rPr>
-        <w:t xml:space="preserve"> Tam(-tam – large), </w:t>
-      </w:r>
-      <w:r>
-        <w:rPr>
-          <w:rFonts w:ascii="Noto Serif" w:eastAsia="Noto Serif SC" w:hAnsi="Noto Serif" w:cs="Noto Serif" w:hint="eastAsia"/>
+        <w:t xml:space="preserve"> </w:t>
+      </w:r>
+      <w:r>
+        <w:rPr>
+          <w:rFonts w:ascii="Noto Serif" w:eastAsia="Noto Serif SC" w:hAnsi="Noto Serif" w:cs="Noto Serif"/>
           <w:sz w:val="20"/>
           <w:szCs w:val="20"/>
           <w:lang w:eastAsia="zh-TW"/>
         </w:rPr>
+        <w:t>(</w:t>
+      </w:r>
+      <w:r>
+        <w:rPr>
+          <w:rFonts w:ascii="Noto Serif" w:eastAsia="Noto Serif SC" w:hAnsi="Noto Serif" w:cs="Noto Serif"/>
+          <w:sz w:val="20"/>
+          <w:szCs w:val="20"/>
+          <w:lang w:eastAsia="zh-TW"/>
+        </w:rPr>
+        <w:t xml:space="preserve">Tam-tam – large), </w:t>
+      </w:r>
+      <w:r>
+        <w:rPr>
+          <w:rFonts w:ascii="Noto Serif" w:eastAsia="Noto Serif SC" w:hAnsi="Noto Serif" w:cs="Noto Serif" w:hint="eastAsia"/>
+          <w:sz w:val="20"/>
+          <w:szCs w:val="20"/>
+          <w:lang w:eastAsia="zh-TW"/>
+        </w:rPr>
         <w:t>碰鈴</w:t>
       </w:r>
       <w:r>
@@ -4751,7 +5187,27 @@
           <w:szCs w:val="20"/>
           <w:lang w:eastAsia="zh-TW"/>
         </w:rPr>
-        <w:t xml:space="preserve"> (Pengling), </w:t>
+        <w:t xml:space="preserve"> (</w:t>
+      </w:r>
+      <w:proofErr w:type="spellStart"/>
+      <w:r>
+        <w:rPr>
+          <w:rFonts w:ascii="Noto Serif" w:eastAsia="Noto Serif SC" w:hAnsi="Noto Serif" w:cs="Noto Serif"/>
+          <w:sz w:val="20"/>
+          <w:szCs w:val="20"/>
+          <w:lang w:eastAsia="zh-TW"/>
+        </w:rPr>
+        <w:t>Pengling</w:t>
+      </w:r>
+      <w:proofErr w:type="spellEnd"/>
+      <w:r>
+        <w:rPr>
+          <w:rFonts w:ascii="Noto Serif" w:eastAsia="Noto Serif SC" w:hAnsi="Noto Serif" w:cs="Noto Serif"/>
+          <w:sz w:val="20"/>
+          <w:szCs w:val="20"/>
+          <w:lang w:eastAsia="zh-TW"/>
+        </w:rPr>
+        <w:t xml:space="preserve">), </w:t>
       </w:r>
       <w:r>
         <w:rPr>
@@ -4970,7 +5426,27 @@
           <w:szCs w:val="20"/>
           <w:lang w:eastAsia="zh-TW"/>
         </w:rPr>
-        <w:t xml:space="preserve"> (Xiaoluo)</w:t>
+        <w:t xml:space="preserve"> (</w:t>
+      </w:r>
+      <w:proofErr w:type="spellStart"/>
+      <w:r>
+        <w:rPr>
+          <w:rFonts w:ascii="Noto Serif" w:eastAsia="Noto Serif SC" w:hAnsi="Noto Serif" w:cs="Noto Serif"/>
+          <w:sz w:val="20"/>
+          <w:szCs w:val="20"/>
+          <w:lang w:eastAsia="zh-TW"/>
+        </w:rPr>
+        <w:t>Xiaoluo</w:t>
+      </w:r>
+      <w:proofErr w:type="spellEnd"/>
+      <w:r>
+        <w:rPr>
+          <w:rFonts w:ascii="Noto Serif" w:eastAsia="Noto Serif SC" w:hAnsi="Noto Serif" w:cs="Noto Serif"/>
+          <w:sz w:val="20"/>
+          <w:szCs w:val="20"/>
+          <w:lang w:eastAsia="zh-TW"/>
+        </w:rPr>
+        <w:t>)</w:t>
       </w:r>
     </w:p>
     <w:p>
@@ -5943,6 +6419,7 @@
   <w:style w:type="character" w:default="1" w:styleId="DefaultParagraphFont">
     <w:name w:val="Default Paragraph Font"/>
     <w:uiPriority w:val="1"/>
+    <w:semiHidden/>
     <w:unhideWhenUsed/>
   </w:style>
   <w:style w:type="table" w:default="1" w:styleId="TableNormal">

</xml_diff>

<commit_message>
Piece 2 Front Matter Done (except Bio)
</commit_message>
<xml_diff>
--- a/Front Matter/Template/2_Front-Matter_Template-v4.docx
+++ b/Front Matter/Template/2_Front-Matter_Template-v4.docx
@@ -351,6 +351,76 @@
           <w:docGrid w:linePitch="360"/>
         </w:sectPr>
       </w:pPr>
+      <w:r>
+        <w:rPr>
+          <w:rFonts w:ascii="STKaiti" w:eastAsia="STKaiti" w:cs="STKaiti" w:hint="eastAsia"/>
+          <w:noProof/>
+          <w:sz w:val="144"/>
+          <w:szCs w:val="72"/>
+        </w:rPr>
+        <w:drawing>
+          <wp:anchor distT="0" distB="0" distL="114300" distR="114300" simplePos="0" relativeHeight="251660288" behindDoc="0" locked="0" layoutInCell="1" allowOverlap="1" wp14:anchorId="23B6A98C" wp14:editId="5B6510A5">
+            <wp:simplePos x="0" y="0"/>
+            <wp:positionH relativeFrom="margin">
+              <wp:align>center</wp:align>
+            </wp:positionH>
+            <wp:positionV relativeFrom="margin">
+              <wp:align>bottom</wp:align>
+            </wp:positionV>
+            <wp:extent cx="1947886" cy="2372348"/>
+            <wp:effectExtent l="0" t="0" r="0" b="3175"/>
+            <wp:wrapSquare wrapText="bothSides"/>
+            <wp:docPr id="1013639289" name="Picture 1013639289" descr="A logo of a musical instrument&#10;&#10;Description automatically generated"/>
+            <wp:cNvGraphicFramePr>
+              <a:graphicFrameLocks xmlns:a="http://schemas.openxmlformats.org/drawingml/2006/main" noChangeAspect="1"/>
+            </wp:cNvGraphicFramePr>
+            <a:graphic xmlns:a="http://schemas.openxmlformats.org/drawingml/2006/main">
+              <a:graphicData uri="http://schemas.openxmlformats.org/drawingml/2006/picture">
+                <pic:pic xmlns:pic="http://schemas.openxmlformats.org/drawingml/2006/picture">
+                  <pic:nvPicPr>
+                    <pic:cNvPr id="1013639289" name="Picture 1013639289" descr="A logo of a musical instrument&#10;&#10;Description automatically generated"/>
+                    <pic:cNvPicPr>
+                      <a:picLocks noChangeAspect="1" noChangeArrowheads="1"/>
+                    </pic:cNvPicPr>
+                  </pic:nvPicPr>
+                  <pic:blipFill>
+                    <a:blip r:embed="rId9" cstate="print">
+                      <a:extLst>
+                        <a:ext uri="{28A0092B-C50C-407E-A947-70E740481C1C}">
+                          <a14:useLocalDpi xmlns:a14="http://schemas.microsoft.com/office/drawing/2010/main" val="0"/>
+                        </a:ext>
+                      </a:extLst>
+                    </a:blip>
+                    <a:srcRect/>
+                    <a:stretch>
+                      <a:fillRect/>
+                    </a:stretch>
+                  </pic:blipFill>
+                  <pic:spPr bwMode="auto">
+                    <a:xfrm>
+                      <a:off x="0" y="0"/>
+                      <a:ext cx="1947886" cy="2372348"/>
+                    </a:xfrm>
+                    <a:prstGeom prst="rect">
+                      <a:avLst/>
+                    </a:prstGeom>
+                    <a:noFill/>
+                    <a:ln>
+                      <a:noFill/>
+                    </a:ln>
+                  </pic:spPr>
+                </pic:pic>
+              </a:graphicData>
+            </a:graphic>
+            <wp14:sizeRelH relativeFrom="page">
+              <wp14:pctWidth>0</wp14:pctWidth>
+            </wp14:sizeRelH>
+            <wp14:sizeRelV relativeFrom="page">
+              <wp14:pctHeight>0</wp14:pctHeight>
+            </wp14:sizeRelV>
+          </wp:anchor>
+        </w:drawing>
+      </w:r>
     </w:p>
     <w:p>
       <w:pPr>
@@ -1108,7 +1178,8 @@
           <w:rFonts w:ascii="Noto Serif" w:eastAsia="Noto Serif SC" w:hAnsi="Noto Serif" w:cs="Noto Serif"/>
           <w:b/>
           <w:color w:val="000000" w:themeColor="text1"/>
-          <w:szCs w:val="32"/>
+          <w:sz w:val="24"/>
+          <w:szCs w:val="36"/>
         </w:rPr>
       </w:pPr>
       <w:r>
@@ -1116,7 +1187,8 @@
           <w:rFonts w:ascii="Noto Serif" w:eastAsia="Noto Serif SC" w:hAnsi="Noto Serif" w:cs="Noto Serif" w:hint="eastAsia"/>
           <w:b/>
           <w:color w:val="000000" w:themeColor="text1"/>
-          <w:szCs w:val="32"/>
+          <w:sz w:val="24"/>
+          <w:szCs w:val="36"/>
         </w:rPr>
         <w:lastRenderedPageBreak/>
         <w:t>九角子</w:t>
@@ -1264,6 +1336,7 @@
     </w:p>
     <w:p>
       <w:pPr>
+        <w:spacing w:line="276" w:lineRule="auto"/>
         <w:rPr>
           <w:rFonts w:ascii="Noto Serif" w:eastAsia="Noto Serif SC" w:hAnsi="Noto Serif" w:cs="Noto Serif"/>
           <w:color w:val="000000" w:themeColor="text1"/>
@@ -1283,6 +1356,7 @@
     </w:p>
     <w:p>
       <w:pPr>
+        <w:spacing w:line="276" w:lineRule="auto"/>
         <w:rPr>
           <w:rFonts w:ascii="Noto Serif" w:eastAsia="Noto Serif SC" w:hAnsi="Noto Serif" w:cs="Noto Serif"/>
           <w:color w:val="000000" w:themeColor="text1"/>
@@ -1485,6 +1559,7 @@
     </w:p>
     <w:p>
       <w:pPr>
+        <w:spacing w:line="276" w:lineRule="auto"/>
         <w:rPr>
           <w:rFonts w:ascii="Noto Serif" w:eastAsia="Noto Serif SC" w:hAnsi="Noto Serif" w:cs="Noto Serif"/>
           <w:color w:val="000000" w:themeColor="text1"/>
@@ -1506,6 +1581,7 @@
     </w:p>
     <w:p>
       <w:pPr>
+        <w:spacing w:line="276" w:lineRule="auto"/>
         <w:rPr>
           <w:rFonts w:ascii="Noto Serif" w:eastAsia="Noto Serif SC" w:hAnsi="Noto Serif" w:cs="Noto Serif"/>
           <w:color w:val="000000" w:themeColor="text1"/>
@@ -1527,6 +1603,7 @@
     </w:p>
     <w:p>
       <w:pPr>
+        <w:spacing w:line="276" w:lineRule="auto"/>
         <w:rPr>
           <w:rFonts w:ascii="Noto Serif" w:eastAsia="Noto Serif SC" w:hAnsi="Noto Serif" w:cs="Noto Serif"/>
           <w:color w:val="000000" w:themeColor="text1"/>
@@ -1548,6 +1625,7 @@
     </w:p>
     <w:p>
       <w:pPr>
+        <w:spacing w:line="276" w:lineRule="auto"/>
         <w:rPr>
           <w:rFonts w:ascii="Noto Serif" w:eastAsia="Noto Serif SC" w:hAnsi="Noto Serif" w:cs="Noto Serif"/>
           <w:color w:val="000000" w:themeColor="text1"/>
@@ -1605,7 +1683,7 @@
         </w:rPr>
         <w:t>Website: </w:t>
       </w:r>
-      <w:hyperlink r:id="rId9" w:tgtFrame="_blank" w:history="1">
+      <w:hyperlink r:id="rId10" w:tgtFrame="_blank" w:history="1">
         <w:r>
           <w:rPr>
             <w:rStyle w:val="Hyperlink"/>
@@ -1645,7 +1723,7 @@
         </w:rPr>
         <w:t>Email: </w:t>
       </w:r>
-      <w:hyperlink r:id="rId10" w:tgtFrame="_blank" w:history="1">
+      <w:hyperlink r:id="rId11" w:tgtFrame="_blank" w:history="1">
         <w:r>
           <w:rPr>
             <w:rStyle w:val="Hyperlink"/>
@@ -1819,7 +1897,7 @@
                     <pic:cNvPicPr/>
                   </pic:nvPicPr>
                   <pic:blipFill>
-                    <a:blip r:embed="rId11" cstate="print">
+                    <a:blip r:embed="rId12" cstate="print">
                       <a:extLst>
                         <a:ext uri="{28A0092B-C50C-407E-A947-70E740481C1C}">
                           <a14:useLocalDpi xmlns:a14="http://schemas.microsoft.com/office/drawing/2010/main" val="0"/>
@@ -2399,7 +2477,7 @@
     </w:p>
     <w:p>
       <w:pPr>
-        <w:spacing w:after="160" w:line="278" w:lineRule="auto"/>
+        <w:spacing w:after="160" w:line="276" w:lineRule="auto"/>
         <w:jc w:val="both"/>
         <w:rPr>
           <w:rFonts w:ascii="Noto Serif" w:eastAsia="Noto Serif SC" w:hAnsi="Noto Serif"/>
@@ -2500,7 +2578,7 @@
     </w:p>
     <w:p>
       <w:pPr>
-        <w:spacing w:after="160" w:line="278" w:lineRule="auto"/>
+        <w:spacing w:after="160" w:line="276" w:lineRule="auto"/>
         <w:jc w:val="both"/>
         <w:rPr>
           <w:rFonts w:ascii="Noto Serif" w:eastAsia="Noto Serif SC" w:hAnsi="Noto Serif"/>
@@ -2584,7 +2662,7 @@
     </w:p>
     <w:p>
       <w:pPr>
-        <w:spacing w:after="160" w:line="278" w:lineRule="auto"/>
+        <w:spacing w:after="160" w:line="276" w:lineRule="auto"/>
         <w:jc w:val="both"/>
         <w:rPr>
           <w:rFonts w:ascii="Noto Serif" w:eastAsia="Noto Serif SC" w:hAnsi="Noto Serif"/>
@@ -2605,7 +2683,7 @@
     </w:p>
     <w:p>
       <w:pPr>
-        <w:spacing w:after="160" w:line="278" w:lineRule="auto"/>
+        <w:spacing w:after="160" w:line="276" w:lineRule="auto"/>
         <w:jc w:val="both"/>
         <w:rPr>
           <w:rFonts w:ascii="Noto Serif" w:eastAsia="Noto Serif SC" w:hAnsi="Noto Serif"/>
@@ -2622,7 +2700,7 @@
     </w:p>
     <w:p>
       <w:pPr>
-        <w:spacing w:after="160" w:line="278" w:lineRule="auto"/>
+        <w:spacing w:after="160" w:line="276" w:lineRule="auto"/>
         <w:jc w:val="both"/>
         <w:rPr>
           <w:rFonts w:ascii="Noto Serif" w:eastAsia="Noto Serif SC" w:hAnsi="Noto Serif"/>
@@ -2634,7 +2712,24 @@
           <w:rFonts w:ascii="Noto Serif" w:eastAsia="Noto Serif SC" w:hAnsi="Noto Serif"/>
           <w:lang w:eastAsia="zh-TW"/>
         </w:rPr>
-        <w:t xml:space="preserve">Born in Hong Kong and now living in U.S.A. He received his Doctor of Musical Arts (D.M.A.) at Rice University and Bachelor of Fine Arts (B.F.A.) at the Hong Kong Academy for Performing Arts. He has attended major music festivals including: Wellesley Composers Conference, Aspen Music Festival, International Summer Course for New Music Darmstadt, Asian Composers’ League, ISCM World Music Days, Chinese Composers’ Festival, Music X, June in Buffalo, IMPULS Ensemble Akademie, California E.A.R. Unit Composer Seminar, the 13th International Summer Program, Czech Republic, International Composers’ Workshop, Luxembourg, the International Summer Course for New Music, Darmstadt, Germany, Wellesley Composers’ Conference. Residencies include: the Atlantic Center for the Arts, Florida, Kimmel Harding Nelson Center for the Arts, Nebraska, Virginia Center for the Creative Arts, </w:t>
+        <w:t>Born in Hong Kong and now living in U.S.A. He received his Doctor of Musical Arts (D.M.A.) at Rice University and Bachelor of Fine Arts (B.F.A.) at the Hong Kong Academy for Performing Arts. He has attended major music festivals including: Wellesley Composers Conference, Aspen Music Festival, International Summer Course for New Music Darmstadt, Asian Composers’ League, ISCM World Music Days, Chinese Composers’ Festival, Music X, June in Buffalo, IMPULS Ensemble Akademie, California E.A.R. Unit Composer Seminar, the 13th International Summer Program, Czech Republic, International Composers’ Workshop, Luxembourg, the International Summer Course for New Music, Darmstadt, Germany, Wellesley Composers’ Conference. Residencies include: the Atlantic Center for the Arts, Florida, Kimmel Harding Nelson Center for the Arts, Nebraska, Virginia Center for the Creative Arts, Yaddo Colony, NY and the MacDowell Colony, NH.</w:t>
+      </w:r>
+    </w:p>
+    <w:p>
+      <w:pPr>
+        <w:spacing w:after="160" w:line="276" w:lineRule="auto"/>
+        <w:jc w:val="both"/>
+        <w:rPr>
+          <w:rFonts w:ascii="Noto Serif" w:eastAsia="Noto Serif SC" w:hAnsi="Noto Serif"/>
+          <w:lang w:eastAsia="zh-TW"/>
+        </w:rPr>
+      </w:pPr>
+      <w:r>
+        <w:rPr>
+          <w:rFonts w:ascii="Noto Serif" w:eastAsia="Noto Serif SC" w:hAnsi="Noto Serif"/>
+          <w:lang w:eastAsia="zh-TW"/>
+        </w:rPr>
+        <w:t>Yip’s works have been performed in the United States, Canada, Costa Rica, Israel, Austria, Croatia, Czech Republic, Luxembourg, Germany, Italy, Korea, Japan, Indonesia, Hong Kong, Taiwan, Singapore, and Philippines. He has received several composition prizes, included “</w:t>
       </w:r>
       <w:proofErr w:type="spellStart"/>
       <w:r>
@@ -2642,7 +2737,7 @@
           <w:rFonts w:ascii="Noto Serif" w:eastAsia="Noto Serif SC" w:hAnsi="Noto Serif"/>
           <w:lang w:eastAsia="zh-TW"/>
         </w:rPr>
-        <w:t>Yaddo</w:t>
+        <w:t>Earplay</w:t>
       </w:r>
       <w:proofErr w:type="spellEnd"/>
       <w:r>
@@ -2650,24 +2745,7 @@
           <w:rFonts w:ascii="Noto Serif" w:eastAsia="Noto Serif SC" w:hAnsi="Noto Serif"/>
           <w:lang w:eastAsia="zh-TW"/>
         </w:rPr>
-        <w:t xml:space="preserve"> Colony, NY and the MacDowell Colony, NH.</w:t>
-      </w:r>
-    </w:p>
-    <w:p>
-      <w:pPr>
-        <w:spacing w:after="160" w:line="278" w:lineRule="auto"/>
-        <w:jc w:val="both"/>
-        <w:rPr>
-          <w:rFonts w:ascii="Noto Serif" w:eastAsia="Noto Serif SC" w:hAnsi="Noto Serif"/>
-          <w:lang w:eastAsia="zh-TW"/>
-        </w:rPr>
-      </w:pPr>
-      <w:r>
-        <w:rPr>
-          <w:rFonts w:ascii="Noto Serif" w:eastAsia="Noto Serif SC" w:hAnsi="Noto Serif"/>
-          <w:lang w:eastAsia="zh-TW"/>
-        </w:rPr>
-        <w:t>Yip’s works have been performed in the United States, Canada, Costa Rica, Israel, Austria, Croatia, Czech Republic, Luxembourg, Germany, Italy, Korea, Japan, Indonesia, Hong Kong, Taiwan, Singapore, and Philippines. He has received several composition prizes, included “</w:t>
+        <w:t xml:space="preserve">”, “Salvatore </w:t>
       </w:r>
       <w:proofErr w:type="spellStart"/>
       <w:r>
@@ -2675,7 +2753,7 @@
           <w:rFonts w:ascii="Noto Serif" w:eastAsia="Noto Serif SC" w:hAnsi="Noto Serif"/>
           <w:lang w:eastAsia="zh-TW"/>
         </w:rPr>
-        <w:t>Earplay</w:t>
+        <w:t>Martirano</w:t>
       </w:r>
       <w:proofErr w:type="spellEnd"/>
       <w:r>
@@ -2683,28 +2761,12 @@
           <w:rFonts w:ascii="Noto Serif" w:eastAsia="Noto Serif SC" w:hAnsi="Noto Serif"/>
           <w:lang w:eastAsia="zh-TW"/>
         </w:rPr>
-        <w:t xml:space="preserve">”, “Salvatore </w:t>
-      </w:r>
-      <w:proofErr w:type="spellStart"/>
-      <w:r>
-        <w:rPr>
-          <w:rFonts w:ascii="Noto Serif" w:eastAsia="Noto Serif SC" w:hAnsi="Noto Serif"/>
-          <w:lang w:eastAsia="zh-TW"/>
-        </w:rPr>
-        <w:t>Martirano</w:t>
-      </w:r>
-      <w:proofErr w:type="spellEnd"/>
-      <w:r>
-        <w:rPr>
-          <w:rFonts w:ascii="Noto Serif" w:eastAsia="Noto Serif SC" w:hAnsi="Noto Serif"/>
-          <w:lang w:eastAsia="zh-TW"/>
-        </w:rPr>
         <w:t xml:space="preserve"> Memorial Composition Award”, “Taiwan Music Center International Composition Prize”, “Robert Avalon International Prize”, “Singapore International Composition Competition for Chinese Orchestra”, “Haifa International Composition Prize”, First International EPICMUSIC Composition Prize, Italy, International Biennial composition competition, the Debussy Trio Music Foundation, Molinari Quartet’s Third International Composition Competition, the St. Paul Chamber Orchestra Emerging, the ALEA III composition Competition, the fourth NACUSA Texas Composition Competition, the International Music Prize for Excellence in Composition 2010, by the National Academy of Music, Thessaloniki, Greece, and the 2010 Alvarez Chamber Orchestra Freestyle Composition Competition, London, England .</w:t>
       </w:r>
     </w:p>
     <w:p>
       <w:pPr>
-        <w:spacing w:after="160" w:line="278" w:lineRule="auto"/>
+        <w:spacing w:after="160" w:line="276" w:lineRule="auto"/>
         <w:jc w:val="both"/>
         <w:rPr>
           <w:rFonts w:ascii="Noto Serif" w:eastAsia="Noto Serif SC" w:hAnsi="Noto Serif"/>
@@ -2777,6 +2839,7 @@
     </w:p>
     <w:p>
       <w:pPr>
+        <w:spacing w:line="276" w:lineRule="auto"/>
         <w:jc w:val="both"/>
         <w:rPr>
           <w:rFonts w:ascii="Noto Serif" w:eastAsia="Noto Serif SC" w:hAnsi="Noto Serif"/>
@@ -5998,16 +6061,6 @@
         <w:rPr>
           <w:rFonts w:ascii="Noto Serif" w:eastAsia="Noto Serif SC" w:hAnsi="Noto Serif" w:cs="Noto Serif"/>
           <w:lang w:val="en-US"/>
-        </w:rPr>
-      </w:pPr>
-    </w:p>
-    <w:p>
-      <w:pPr>
-        <w:rPr>
-          <w:rFonts w:ascii="Noto Serif" w:eastAsia="Noto Serif SC" w:hAnsi="Noto Serif" w:cs="Noto Serif"/>
-          <w:bCs/>
-          <w:sz w:val="28"/>
-          <w:szCs w:val="28"/>
         </w:rPr>
       </w:pPr>
     </w:p>
@@ -6106,62 +6159,6 @@
       <w:pStyle w:val="Footer"/>
       <w:jc w:val="center"/>
     </w:pPr>
-    <w:r>
-      <w:rPr>
-        <w:rFonts w:ascii="STKaiti" w:eastAsia="STKaiti" w:cs="STKaiti" w:hint="eastAsia"/>
-        <w:noProof/>
-        <w:sz w:val="144"/>
-        <w:szCs w:val="72"/>
-      </w:rPr>
-      <w:drawing>
-        <wp:inline distT="0" distB="0" distL="0" distR="0" wp14:anchorId="78C64FA9" wp14:editId="28637CE4">
-          <wp:extent cx="1947886" cy="2372348"/>
-          <wp:effectExtent l="0" t="0" r="0" b="3175"/>
-          <wp:docPr id="673708336" name="Picture 673708336"/>
-          <wp:cNvGraphicFramePr>
-            <a:graphicFrameLocks xmlns:a="http://schemas.openxmlformats.org/drawingml/2006/main" noChangeAspect="1"/>
-          </wp:cNvGraphicFramePr>
-          <a:graphic xmlns:a="http://schemas.openxmlformats.org/drawingml/2006/main">
-            <a:graphicData uri="http://schemas.openxmlformats.org/drawingml/2006/picture">
-              <pic:pic xmlns:pic="http://schemas.openxmlformats.org/drawingml/2006/picture">
-                <pic:nvPicPr>
-                  <pic:cNvPr id="0" name="Picture 1"/>
-                  <pic:cNvPicPr>
-                    <a:picLocks noChangeAspect="1" noChangeArrowheads="1"/>
-                  </pic:cNvPicPr>
-                </pic:nvPicPr>
-                <pic:blipFill>
-                  <a:blip r:embed="rId1">
-                    <a:extLst>
-                      <a:ext uri="{28A0092B-C50C-407E-A947-70E740481C1C}">
-                        <a14:useLocalDpi xmlns:a14="http://schemas.microsoft.com/office/drawing/2010/main" val="0"/>
-                      </a:ext>
-                    </a:extLst>
-                  </a:blip>
-                  <a:srcRect/>
-                  <a:stretch>
-                    <a:fillRect/>
-                  </a:stretch>
-                </pic:blipFill>
-                <pic:spPr bwMode="auto">
-                  <a:xfrm>
-                    <a:off x="0" y="0"/>
-                    <a:ext cx="1986581" cy="2419475"/>
-                  </a:xfrm>
-                  <a:prstGeom prst="rect">
-                    <a:avLst/>
-                  </a:prstGeom>
-                  <a:noFill/>
-                  <a:ln>
-                    <a:noFill/>
-                  </a:ln>
-                </pic:spPr>
-              </pic:pic>
-            </a:graphicData>
-          </a:graphic>
-        </wp:inline>
-      </w:drawing>
-    </w:r>
   </w:p>
 </w:ftr>
 </file>

</xml_diff>